<commit_message>
docs: Thesis angereichert mit CAS Modulunterlagen Tag 10+11
Neue Inhalte in HKTracker_CAS_Abschlussarbeit_Entwurf_v01.docx:
- 1.4.1 Personas: Heinz, Viktor, Michi, KUI mit Methodik-Kontext (Seyff/Patkar)
- 2.5 SusAF-Analyse: 5 Dimensionen, 4 Ursache-Wirkungs-Ketten, NFA-S1 bis NFA-S4
- 4.3.1 Sicherheitsrisiken: Veracode 2025, Cotroneo 2025, Prompt Injection, Supply Chain
- 4.3.2 Nachhaltigkeitsanalyse: Querverweis auf 2.5 mit Kernbefund
- Literatur: R24-R38 (Cooper, Patkar, Becker, Veracode, Arditi, Greshake, Park, Argyle, ...)
- Glossar: APR, MAPE-K, OWASP, SusAF, SWE-Bench, Silicon Sampling
- Abkuerzungsverzeichnis: APR, MAPE-K, OWASP, SusAF, XSS

Co-Authored-By: Claude Sonnet 4.6 <noreply@anthropic.com>
</commit_message>
<xml_diff>
--- a/doku/HKTracker_CAS_Abschlussarbeit_Entwurf_v01.docx
+++ b/doku/HKTracker_CAS_Abschlussarbeit_Entwurf_v01.docx
@@ -4573,6 +4573,262 @@
     </w:p>
     <w:p>
       <w:pPr>
+        <w:pStyle w:val="Standard"/>
+      </w:pPr>
+      <w:r>
+        <w:t/>
+      </w:r>
+    </w:p>
+    <w:p>
+      <w:pPr>
+        <w:pStyle w:val="berschrift3"/>
+      </w:pPr>
+      <w:r>
+        <w:t>1.4.1  Personas (Nutzerprofile)</w:t>
+      </w:r>
+    </w:p>
+    <w:p>
+      <w:pPr>
+        <w:pStyle w:val="Standard"/>
+      </w:pPr>
+      <w:r>
+        <w:t>Die vier zentralen Nutzergruppen wurden als Cooper-Personas (zielorientiert) modelliert und bilden die Grundlage für die Requirements-Erhebung sowie das UX-Design des HK-Trackers.  vgl. [R25] Cooper 1999</w:t>
+      </w:r>
+    </w:p>
+    <w:p>
+      <w:pPr>
+        <w:pStyle w:val="Standard"/>
+      </w:pPr>
+      <w:r>
+        <w:t/>
+      </w:r>
+    </w:p>
+    <w:p>
+      <w:pPr>
+        <w:pStyle w:val="Standard"/>
+      </w:pPr>
+      <w:r>
+        <w:t>Methodik: Im Unterschied zu klassischen Ad-hoc-Personas, die am Projektstart erstellt und danach nie validiert werden («created, never validated, never evolved» – Patkar &amp; Seyff 2023), sollen die HK-Tracker-Personas im Pilotbetrieb mit echten Nutzerinnen und Nutzern validiert und bei Bedarf angepasst werden.  vgl. [R24] Patkar &amp; Seyff REFSQ 2023</w:t>
+      </w:r>
+    </w:p>
+    <w:p>
+      <w:pPr>
+        <w:pStyle w:val="Standard"/>
+      </w:pPr>
+      <w:r>
+        <w:t/>
+      </w:r>
+    </w:p>
+    <w:p>
+      <w:pPr>
+        <w:pStyle w:val="Aufzhlungszeichen"/>
+      </w:pPr>
+      <w:r>
+        <w:t>Persona 1 – Heinz, 17, Lernender Informatik EFZ AppDev (1. Lehrjahr)</w:t>
+      </w:r>
+    </w:p>
+    <w:p>
+      <w:pPr>
+        <w:pStyle w:val="Aufzhlungszeichen2"/>
+      </w:pPr>
+      <w:r>
+        <w:t>Rolle: Lernender in Anwendungsentwicklungs-Rotation; erste Monate im Betrieb</w:t>
+      </w:r>
+    </w:p>
+    <w:p>
+      <w:pPr>
+        <w:pStyle w:val="Aufzhlungszeichen2"/>
+      </w:pPr>
+      <w:r>
+        <w:t>Bedürfnis: einfache Orientierung, klare Anforderungen, schnelle Erfassung von Lernnachweisen</w:t>
+      </w:r>
+    </w:p>
+    <w:p>
+      <w:pPr>
+        <w:pStyle w:val="Aufzhlungszeichen2"/>
+      </w:pPr>
+      <w:r>
+        <w:t>Frustration: Word-Formulare veraltet; unklar, welche Kompetenzen noch fehlen</w:t>
+      </w:r>
+    </w:p>
+    <w:p>
+      <w:pPr>
+        <w:pStyle w:val="Aufzhlungszeichen2"/>
+      </w:pPr>
+      <w:r>
+        <w:t>HK-Tracker Mehrwert: intuitive Web-App, strukturierter Überblick, Rotationsplanung sichtbar</w:t>
+      </w:r>
+    </w:p>
+    <w:p>
+      <w:pPr>
+        <w:pStyle w:val="Standard"/>
+      </w:pPr>
+      <w:r>
+        <w:t/>
+      </w:r>
+    </w:p>
+    <w:p>
+      <w:pPr>
+        <w:pStyle w:val="Aufzhlungszeichen"/>
+      </w:pPr>
+      <w:r>
+        <w:t>Persona 2 – Viktor, 18, Lernender ICT-Fachmann EFZ (2. Lehrjahr)</w:t>
+      </w:r>
+    </w:p>
+    <w:p>
+      <w:pPr>
+        <w:pStyle w:val="Aufzhlungszeichen2"/>
+      </w:pPr>
+      <w:r>
+        <w:t>Rolle: Lernender in Plattformbetrieb-Rotation, führt vor allem Support-Aufgaben durch</w:t>
+      </w:r>
+    </w:p>
+    <w:p>
+      <w:pPr>
+        <w:pStyle w:val="Aufzhlungszeichen2"/>
+      </w:pPr>
+      <w:r>
+        <w:t>Bedürfnis: nachvollziehbare Bewertung, wissen woran man ist, Lücken früh erkennen</w:t>
+      </w:r>
+    </w:p>
+    <w:p>
+      <w:pPr>
+        <w:pStyle w:val="Aufzhlungszeichen2"/>
+      </w:pPr>
+      <w:r>
+        <w:t>Frustration: Beurteilungen kommen spät, Kriterien unklar; Excel-Listen schwer lesbar</w:t>
+      </w:r>
+    </w:p>
+    <w:p>
+      <w:pPr>
+        <w:pStyle w:val="Aufzhlungszeichen2"/>
+      </w:pPr>
+      <w:r>
+        <w:t>HK-Tracker Mehrwert: Live-Fortschrittsanzeige, Eigeneinschätzung vor KI-Vorschlag</w:t>
+      </w:r>
+    </w:p>
+    <w:p>
+      <w:pPr>
+        <w:pStyle w:val="Standard"/>
+      </w:pPr>
+      <w:r>
+        <w:t/>
+      </w:r>
+    </w:p>
+    <w:p>
+      <w:pPr>
+        <w:pStyle w:val="Aufzhlungszeichen"/>
+      </w:pPr>
+      <w:r>
+        <w:t>Persona 3 – Michi, 35, Praxisbildner Softwareentwicklung</w:t>
+      </w:r>
+    </w:p>
+    <w:p>
+      <w:pPr>
+        <w:pStyle w:val="Aufzhlungszeichen2"/>
+      </w:pPr>
+      <w:r>
+        <w:t>Rolle: Software-Engineer, betreut Informatik-Lernende; kein Pädagogik-Studium</w:t>
+      </w:r>
+    </w:p>
+    <w:p>
+      <w:pPr>
+        <w:pStyle w:val="Aufzhlungszeichen2"/>
+      </w:pPr>
+      <w:r>
+        <w:t>Bedürfnis: schnelle Bloom-Einschätzung ohne Taxonomie-Expertenwissen, wenig Aufwand</w:t>
+      </w:r>
+    </w:p>
+    <w:p>
+      <w:pPr>
+        <w:pStyle w:val="Aufzhlungszeichen2"/>
+      </w:pPr>
+      <w:r>
+        <w:t>Frustration: unklare Abgrenzung K3 vs. K4; Dokumentationsaufwand frisst Entwicklungszeit</w:t>
+      </w:r>
+    </w:p>
+    <w:p>
+      <w:pPr>
+        <w:pStyle w:val="Aufzhlungszeichen2"/>
+      </w:pPr>
+      <w:r>
+        <w:t>HK-Tracker Mehrwert: KI-Vorschlag mit Begründung → Lerneffekt für Praxisbildner selbst</w:t>
+      </w:r>
+    </w:p>
+    <w:p>
+      <w:pPr>
+        <w:pStyle w:val="Standard"/>
+      </w:pPr>
+      <w:r>
+        <w:t/>
+      </w:r>
+    </w:p>
+    <w:p>
+      <w:pPr>
+        <w:pStyle w:val="Aufzhlungszeichen"/>
+      </w:pPr>
+      <w:r>
+        <w:t>Persona 4 – KUI, 50, Ausbildungsverantwortliche</w:t>
+      </w:r>
+    </w:p>
+    <w:p>
+      <w:pPr>
+        <w:pStyle w:val="Aufzhlungszeichen2"/>
+      </w:pPr>
+      <w:r>
+        <w:t>Rolle: Leiterin Berufsbildung FHNW, verantwortet Compliance, Budget, Reporting</w:t>
+      </w:r>
+    </w:p>
+    <w:p>
+      <w:pPr>
+        <w:pStyle w:val="Aufzhlungszeichen2"/>
+      </w:pPr>
+      <w:r>
+        <w:t>Bedürfnis: kompakte Übersichten, Audit-fähige Nachweise, Datenschutzkonformität</w:t>
+      </w:r>
+    </w:p>
+    <w:p>
+      <w:pPr>
+        <w:pStyle w:val="Aufzhlungszeichen2"/>
+      </w:pPr>
+      <w:r>
+        <w:t>Frustration: manuelle Aggregation über alle Lernenden in Excel; fehlende Transparenz</w:t>
+      </w:r>
+    </w:p>
+    <w:p>
+      <w:pPr>
+        <w:pStyle w:val="Aufzhlungszeichen2"/>
+      </w:pPr>
+      <w:r>
+        <w:t>HK-Tracker Mehrwert: automatische Gesamtauswertungen, Exportfunktion, DSGVO-Konformität</w:t>
+      </w:r>
+    </w:p>
+    <w:p>
+      <w:pPr>
+        <w:pStyle w:val="Standard"/>
+      </w:pPr>
+      <w:r>
+        <w:t/>
+      </w:r>
+    </w:p>
+    <w:p>
+      <w:pPr>
+        <w:pStyle w:val="Standard"/>
+      </w:pPr>
+      <w:r>
+        <w:t>Die Personas wurden im Rahmen von Modultag 11 (Seyff, FHNW) erarbeitet und orientieren sich am Cooper-Ansatz (zielorientiert). Sie werden im Pilotbetrieb (Phase 3) durch strukturierte Interviews nach RE-Methodik validiert.  vgl. [R24] Patkar &amp; Seyff 2023; [R25] Cooper 1999; Tag 11 Seyff FHNW</w:t>
+      </w:r>
+    </w:p>
+    <w:p>
+      <w:pPr>
+        <w:pStyle w:val="Standard"/>
+      </w:pPr>
+      <w:r>
+        <w:t/>
+      </w:r>
+    </w:p>
+    <w:p>
+      <w:pPr>
         <w:rPr>
           <w:lang w:val="de-CH"/>
         </w:rPr>
@@ -6543,6 +6799,172 @@
       </w:r>
     </w:p>
     <w:p>
+      <w:pPr/>
+    </w:p>
+    <w:p>
+      <w:pPr>
+        <w:pStyle w:val="berschrift2"/>
+      </w:pPr>
+      <w:r>
+        <w:t>2.5  Nachhaltigkeitsanforderungen aus SusAF-Analyse</w:t>
+      </w:r>
+    </w:p>
+    <w:p>
+      <w:pPr/>
+      <w:r>
+        <w:t>[Vorgabe] Nachhaltigkeitsanforderungen: Nicht-funktionale Anforderungen aus der Nachhaltigkeitsperspektive.  vgl. Tag 11 SusAF-Framework Becker et al.</w:t>
+      </w:r>
+    </w:p>
+    <w:p>
+      <w:pPr/>
+      <w:r>
+        <w:t>Methode: Sustainability Awareness Framework (SusAF) – 5 Dimensionen × 3 Ebenen (Immediate, Enabling, Systemic). Angewendet auf den HK-Tracker in Modultag 11.  vgl. [R26] Becker et al. 2016; [R27] Penzenstadler et al. 2014</w:t>
+      </w:r>
+    </w:p>
+    <w:p>
+      <w:pPr/>
+    </w:p>
+    <w:p>
+      <w:pPr/>
+      <w:r>
+        <w:t>SusAF-Analyse (5 Dimensionen):</w:t>
+      </w:r>
+    </w:p>
+    <w:p>
+      <w:pPr>
+        <w:pStyle w:val="Aufzhlungszeichen"/>
+      </w:pPr>
+      <w:r>
+        <w:t>Technisch: Cloud-Native-Architektur (12-Factor App); Wartbarkeit durch arc42 + ADRs; Risiko: Azure-OpenAI-Abhängigkeit</w:t>
+      </w:r>
+    </w:p>
+    <w:p>
+      <w:pPr>
+        <w:pStyle w:val="Aufzhlungszeichen"/>
+      </w:pPr>
+      <w:r>
+        <w:t>Sozial: KI-Vorschläge unterstützen Berufsbildner, ersetzen kein pädagogisches Urteil; Transparenzpflicht gegenüber Lernenden (DSG Art. 19)</w:t>
+      </w:r>
+    </w:p>
+    <w:p>
+      <w:pPr>
+        <w:pStyle w:val="Aufzhlungszeichen"/>
+      </w:pPr>
+      <w:r>
+        <w:t>Wirtschaftlich: Open-Source-Prototyp (kein Lizenzaufwand); Azure OpenAI-Kosten on-demand; Zeitersparnis &gt; 50% Dokumentationsaufwand als wirtschaftlicher Nutzen</w:t>
+      </w:r>
+    </w:p>
+    <w:p>
+      <w:pPr>
+        <w:pStyle w:val="Aufzhlungszeichen"/>
+      </w:pPr>
+      <w:r>
+        <w:t>Ökologisch: LLM-Aufrufe nur on-demand (kein Batch); Azure EU Data Center mit Renewable Energy Commitment; Bloom-Cache für Wiederholungsanfragen geplant</w:t>
+      </w:r>
+    </w:p>
+    <w:p>
+      <w:pPr>
+        <w:pStyle w:val="Aufzhlungszeichen"/>
+      </w:pPr>
+      <w:r>
+        <w:t>Individuell: Lernende erhalten strukturiertes Kompetenz-Feedback; Berufsbildner lernen Bloom-Taxonomie durch KI-Begründungen (Upskilling-Effekt)</w:t>
+      </w:r>
+    </w:p>
+    <w:p>
+      <w:pPr/>
+    </w:p>
+    <w:p>
+      <w:pPr/>
+      <w:r>
+        <w:t>Kernbotschaft: «KI als Reflexionsanstoss, nicht als Reflexionsersatz»  vgl. Tag 11 SusAF-Analyse HK-Tracker</w:t>
+      </w:r>
+    </w:p>
+    <w:p>
+      <w:pPr/>
+    </w:p>
+    <w:p>
+      <w:pPr/>
+      <w:r>
+        <w:t>Ursache-Wirkungs-Ketten:</w:t>
+      </w:r>
+    </w:p>
+    <w:p>
+      <w:pPr>
+        <w:pStyle w:val="Aufzhlungszeichen"/>
+      </w:pPr>
+      <w:r>
+        <w:t>Positiv 1: Lernnachweis erfasst → KI schlägt Bloom vor → Berufsbildner reflektiert Begründung → eigene Bloom-Expertise steigt → konsistentere Bewertungen → bessere Rotationsplanung</w:t>
+      </w:r>
+    </w:p>
+    <w:p>
+      <w:pPr>
+        <w:pStyle w:val="Aufzhlungszeichen"/>
+      </w:pPr>
+      <w:r>
+        <w:t>Positiv 2: Eigeneinschätzung (NFA-S1) erzwungen → Lernende formulieren Stärken/Schwächen → strukturierte Reflexion → höhere Lernmotivation und Selbstwirksamkeit</w:t>
+      </w:r>
+    </w:p>
+    <w:p>
+      <w:pPr>
+        <w:pStyle w:val="Aufzhlungszeichen"/>
+      </w:pPr>
+      <w:r>
+        <w:t>Negativ 1: KI-Vorschlag ohne kritische Prüfung übernommen → Automation Bias → Bloom-Bewertungen verlieren pädagogische Tiefe → Qualitätsverlust in der Ausbildung</w:t>
+      </w:r>
+    </w:p>
+    <w:p>
+      <w:pPr>
+        <w:pStyle w:val="Aufzhlungszeichen"/>
+      </w:pPr>
+      <w:r>
+        <w:t>Negativ 2: Lernende erkennen Muster im KI-Vorschlag → passen Texte strategisch an → Gaming-Effekt → Kompetenznachweise verlieren Authentizität</w:t>
+      </w:r>
+    </w:p>
+    <w:p>
+      <w:pPr/>
+    </w:p>
+    <w:p>
+      <w:pPr/>
+      <w:r>
+        <w:t>Abgeleitete Nachhaltigkeitsanforderungen (NFA):</w:t>
+      </w:r>
+    </w:p>
+    <w:p>
+      <w:pPr>
+        <w:pStyle w:val="Aufzhlungszeichen"/>
+      </w:pPr>
+      <w:r>
+        <w:t>NFA-S1: Pflichtfeld Eigeneinschätzung vor KI-Vorschlag – Lernende erfassen eigene Bloom-Einschätzung, bevor KI-Vorschlag angezeigt wird. Verhindert kognitive Passivität; stärkt Reflexionskompetenz. SusAF-Dimension: Individuell/Sozial.</w:t>
+      </w:r>
+    </w:p>
+    <w:p>
+      <w:pPr>
+        <w:pStyle w:val="Aufzhlungszeichen"/>
+      </w:pPr>
+      <w:r>
+        <w:t>NFA-S2: Automatische Datenlöschung 2 Jahre nach Lehrabschluss – DSG-konform (Right to Erasure). SusAF-Dimension: Sozial/Technisch.</w:t>
+      </w:r>
+    </w:p>
+    <w:p>
+      <w:pPr>
+        <w:pStyle w:val="Aufzhlungszeichen"/>
+      </w:pPr>
+      <w:r>
+        <w:t>NFA-S3: Kein Training externer KI-Modelle mit Inhaltsdaten – Azure OpenAI Contract muss «Opt-Out Training» sicherstellen; kein Fine-Tuning auf Lernendendaten. SusAF-Dimension: Sozial/Technisch.  vgl. [R30] Arditi et al. 2024</w:t>
+      </w:r>
+    </w:p>
+    <w:p>
+      <w:pPr>
+        <w:pStyle w:val="Aufzhlungszeichen"/>
+      </w:pPr>
+      <w:r>
+        <w:t>NFA-S4: KI-Vorschläge als überarbeitbare Entwürfe kennzeichnen – im UI klar als «KI-Vorschlag» markieren; Berufsbildner-Entscheid separat speichern; verhindert Automation Bias. SusAF-Dimension: Sozial.  vgl. [R28] Veracode 2025</w:t>
+      </w:r>
+    </w:p>
+    <w:p>
+      <w:pPr/>
+    </w:p>
+    <w:p>
       <w:pPr>
         <w:pStyle w:val="berschrift1"/>
         <w:rPr>
@@ -10107,6 +10529,206 @@
     </w:p>
     <w:p>
       <w:pPr>
+        <w:pStyle w:val="Standard"/>
+      </w:pPr>
+      <w:r>
+        <w:t/>
+      </w:r>
+    </w:p>
+    <w:p>
+      <w:pPr>
+        <w:pStyle w:val="berschrift3"/>
+      </w:pPr>
+      <w:r>
+        <w:t>4.3.1  Sicherheitsrisiken durch KI-generierten Code</w:t>
+      </w:r>
+    </w:p>
+    <w:p>
+      <w:pPr>
+        <w:pStyle w:val="Standard"/>
+      </w:pPr>
+      <w:r>
+        <w:t>Ein bisher unterschätztes Risiko bei der KI-gestützten Softwareentwicklung betrifft die Sicherheit des generierten Codes.  vgl. Tag 10 Scherb – Security in the Age of AI</w:t>
+      </w:r>
+    </w:p>
+    <w:p>
+      <w:pPr>
+        <w:pStyle w:val="Standard"/>
+      </w:pPr>
+      <w:r>
+        <w:t/>
+      </w:r>
+    </w:p>
+    <w:p>
+      <w:pPr>
+        <w:pStyle w:val="Standard"/>
+      </w:pPr>
+      <w:r>
+        <w:t>Empirische Befunde:</w:t>
+      </w:r>
+    </w:p>
+    <w:p>
+      <w:pPr>
+        <w:pStyle w:val="Aufzhlungszeichen"/>
+      </w:pPr>
+      <w:r>
+        <w:t>Veracode (2025): 45% des KI-generierten Codes enthält OWASP-Top-10-Schwachstellen  vgl. [R28] Veracode 2025</w:t>
+      </w:r>
+    </w:p>
+    <w:p>
+      <w:pPr>
+        <w:pStyle w:val="Aufzhlungszeichen"/>
+      </w:pPr>
+      <w:r>
+        <w:t>Cotroneo, Improta &amp; Liguori (2025): KI-Code weist 1,9–2,7× höhere Schwachstellen-dichte auf als menschlicher Code; 1,75× mehr Logikfehler; 2,74× mehr XSS  vgl. [R29] Cotroneo et al. 2025</w:t>
+      </w:r>
+    </w:p>
+    <w:p>
+      <w:pPr>
+        <w:pStyle w:val="Aufzhlungszeichen"/>
+      </w:pPr>
+      <w:r>
+        <w:t>69% der Organisationen haben KI-eingebrachte Sicherheitslücken identifiziert  vgl. Tag 10 Scherb FHNW</w:t>
+      </w:r>
+    </w:p>
+    <w:p>
+      <w:pPr>
+        <w:pStyle w:val="Aufzhlungszeichen"/>
+      </w:pPr>
+      <w:r>
+        <w:t>Amazon intern: ~5× mehr Betriebsprobleme 2025 vs. 2024 (korreliert mit skaliertem KI-Code-Einsatz)  vgl. Tag 10 Scherb</w:t>
+      </w:r>
+    </w:p>
+    <w:p>
+      <w:pPr>
+        <w:pStyle w:val="Standard"/>
+      </w:pPr>
+      <w:r>
+        <w:t/>
+      </w:r>
+    </w:p>
+    <w:p>
+      <w:pPr>
+        <w:pStyle w:val="Standard"/>
+      </w:pPr>
+      <w:r>
+        <w:t>Spezifische Risiken für den HK-Tracker:</w:t>
+      </w:r>
+    </w:p>
+    <w:p>
+      <w:pPr>
+        <w:pStyle w:val="Aufzhlungszeichen"/>
+      </w:pPr>
+      <w:r>
+        <w:t>Lost Shared Knowledge: KI-Code «landet ohne» gemeinsames mentales Modell; Bus-Faktor ≈ 0 am ersten Tag – kritisch beim Solo-Entwickler-Ansatz</w:t>
+      </w:r>
+    </w:p>
+    <w:p>
+      <w:pPr>
+        <w:pStyle w:val="Aufzhlungszeichen"/>
+      </w:pPr>
+      <w:r>
+        <w:t>Model Supply Chain Risk: Manipulierte System-Prompts in Coding-Tools (.cursor/rules) können Backdoors in scheinbar sauberem Code platzieren  vgl. [R33] Pillar Security 2025</w:t>
+      </w:r>
+    </w:p>
+    <w:p>
+      <w:pPr>
+        <w:pStyle w:val="Aufzhlungszeichen"/>
+      </w:pPr>
+      <w:r>
+        <w:t>Prompt Injection: Lernenden-Freitexte, die an Azure OpenAI gesendet werden, sind attacker-controlled → Indirect-Prompt-Injection-Risiko  vgl. [R31] Greshake et al. 2023</w:t>
+      </w:r>
+    </w:p>
+    <w:p>
+      <w:pPr>
+        <w:pStyle w:val="Aufzhlungszeichen"/>
+      </w:pPr>
+      <w:r>
+        <w:t>Abliteration: Open-Weight-Modelle können so modifiziert werden, dass Sicherheits-Refusals entfernt werden; Self-Hosting ist keine Sicherheitsgarantie  vgl. [R30] Arditi et al. 2024</w:t>
+      </w:r>
+    </w:p>
+    <w:p>
+      <w:pPr>
+        <w:pStyle w:val="Standard"/>
+      </w:pPr>
+      <w:r>
+        <w:t/>
+      </w:r>
+    </w:p>
+    <w:p>
+      <w:pPr>
+        <w:pStyle w:val="Standard"/>
+      </w:pPr>
+      <w:r>
+        <w:t>Gegenmassnahmen (Defense-in-Depth):</w:t>
+      </w:r>
+    </w:p>
+    <w:p>
+      <w:pPr>
+        <w:pStyle w:val="Aufzhlungszeichen"/>
+      </w:pPr>
+      <w:r>
+        <w:t>Provenance: KI-generierte Abschnitte im Git-History markieren (co-authored-by); manuelle Security-Reviews</w:t>
+      </w:r>
+    </w:p>
+    <w:p>
+      <w:pPr>
+        <w:pStyle w:val="Aufzhlungszeichen"/>
+      </w:pPr>
+      <w:r>
+        <w:t>Process: ESLint, statische Analyse vor Commit; Prinzip «Never let one model be both author and judge»</w:t>
+      </w:r>
+    </w:p>
+    <w:p>
+      <w:pPr>
+        <w:pStyle w:val="Aufzhlungszeichen"/>
+      </w:pPr>
+      <w:r>
+        <w:t>Verification: HTTP-Snapshot-Regressionstests vor jeder KI-Integration; OWASP-Checkliste für API-Endpunkte</w:t>
+      </w:r>
+    </w:p>
+    <w:p>
+      <w:pPr>
+        <w:pStyle w:val="Aufzhlungszeichen"/>
+      </w:pPr>
+      <w:r>
+        <w:t>Adversarial Review: Indirect Prompt Injection Simulation gegen eigenen Bloom-Endpunkt  vgl. [R31] Greshake et al. 2023</w:t>
+      </w:r>
+    </w:p>
+    <w:p>
+      <w:pPr>
+        <w:pStyle w:val="Standard"/>
+      </w:pPr>
+      <w:r>
+        <w:t/>
+      </w:r>
+    </w:p>
+    <w:p>
+      <w:pPr>
+        <w:pStyle w:val="berschrift3"/>
+      </w:pPr>
+      <w:r>
+        <w:t>4.3.2  Nachhaltigkeitsanalyse (SusAF)</w:t>
+      </w:r>
+    </w:p>
+    <w:p>
+      <w:pPr>
+        <w:pStyle w:val="Standard"/>
+      </w:pPr>
+      <w:r>
+        <w:t>Die vollständige SusAF-Analyse (5 Dimensionen) und die abgeleiteten Nachhaltigkeitsanforderungen NFA-S1 bis NFA-S4 sind in Abschnitt 2.5 dokumentiert. Kernbefund: HK-Tracker hat primär positive Wirkung auf die Dimensionen Sozial und Individuell; ökologischer Footprint bleibt durch on-demand KI-Einsatz kontrolliert.  vgl. [R26] Becker et al. SusAF; Tag 11</w:t>
+      </w:r>
+    </w:p>
+    <w:p>
+      <w:pPr>
+        <w:pStyle w:val="Standard"/>
+      </w:pPr>
+      <w:r>
+        <w:t/>
+      </w:r>
+    </w:p>
+    <w:p>
+      <w:pPr>
         <w:rPr>
           <w:lang w:val="de-CH"/>
         </w:rPr>
@@ -10950,6 +11572,126 @@
     </w:p>
     <w:p>
       <w:pPr>
+        <w:pStyle w:val="Listenabsatz"/>
+      </w:pPr>
+      <w:r>
+        <w:t>[R24] Patkar, V., &amp; Seyff, N. (2023). From Personas to Persona Engines: Challenges and Opportunities. Proceedings of REFSQ 2023. https://doi.org/10.1007/978-3-031-29786-1_14</w:t>
+      </w:r>
+    </w:p>
+    <w:p>
+      <w:pPr>
+        <w:pStyle w:val="Listenabsatz"/>
+      </w:pPr>
+      <w:r>
+        <w:t>[R25] Cooper, A. (1999). The Inmates Are Running the Asylum: Why High-Tech Products Drive Us Crazy and How to Restore the Sanity. Sams Publishing.</w:t>
+      </w:r>
+    </w:p>
+    <w:p>
+      <w:pPr>
+        <w:pStyle w:val="Listenabsatz"/>
+      </w:pPr>
+      <w:r>
+        <w:t>[R26] Becker, C., Chitchyan, R., Duboc, L., Easterbrook, S., Penzenstadler, B., Seyff, N., &amp; Venters, C. C. (2016). Sustainability Design and Software: The Karlskrona Manifesto. In Proceedings of ICSE 2015. IEEE. https://doi.org/10.1109/ICSE.2015.179</w:t>
+      </w:r>
+    </w:p>
+    <w:p>
+      <w:pPr>
+        <w:pStyle w:val="Listenabsatz"/>
+      </w:pPr>
+      <w:r>
+        <w:t>[R27] Penzenstadler, B., Raturi, A., Richardson, D., &amp; Tomlinson, B. (2014). Safety, security, now sustainability: The non-functional requirement for the 21st century. IEEE Software, 31(3), 40-47. https://doi.org/10.1109/MS.2014.53</w:t>
+      </w:r>
+    </w:p>
+    <w:p>
+      <w:pPr>
+        <w:pStyle w:val="Listenabsatz"/>
+      </w:pPr>
+      <w:r>
+        <w:t>[R28] Veracode. (2025). State of Software Security: AI-Generated Code and Vulnerability Trends. Veracode Research Report 2025.</w:t>
+      </w:r>
+    </w:p>
+    <w:p>
+      <w:pPr>
+        <w:pStyle w:val="Listenabsatz"/>
+      </w:pPr>
+      <w:r>
+        <w:t>[R29] Cotroneo, D., Improta, C., &amp; Liguori, P. (2025). On the vulnerability of AI-generated code: An empirical study. [Konferenzpaper, DOI zu ergaenzen]</w:t>
+      </w:r>
+    </w:p>
+    <w:p>
+      <w:pPr>
+        <w:pStyle w:val="Listenabsatz"/>
+      </w:pPr>
+      <w:r>
+        <w:t>[R30] Arditi, A., et al. (2024). Refusal in Language Models Is Mediated by a Single Direction. Advances in Neural Information Processing Systems (NeurIPS 2024). https://arxiv.org/abs/2406.11717</w:t>
+      </w:r>
+    </w:p>
+    <w:p>
+      <w:pPr>
+        <w:pStyle w:val="Listenabsatz"/>
+      </w:pPr>
+      <w:r>
+        <w:t>[R31] Greshake, K., et al. (2023). Not what you've signed up for: Compromising Real-World LLM-Integrated Applications with Indirect Prompt Injection. AISec Workshop, ACM CCS 2023. https://arxiv.org/abs/2302.12173</w:t>
+      </w:r>
+    </w:p>
+    <w:p>
+      <w:pPr>
+        <w:pStyle w:val="Listenabsatz"/>
+      </w:pPr>
+      <w:r>
+        <w:t>[R32] Yang, G., et al. (2025). Survey on LLM-based Automated Program Repair. arXiv:2506.23749.</w:t>
+      </w:r>
+    </w:p>
+    <w:p>
+      <w:pPr>
+        <w:pStyle w:val="Listenabsatz"/>
+      </w:pPr>
+      <w:r>
+        <w:t>[R33] Pillar Security. (2025). Rules-File Backdoor: Supply Chain Attack via Cursor and Copilot System Prompts. Pillar Security Research Blog.</w:t>
+      </w:r>
+    </w:p>
+    <w:p>
+      <w:pPr>
+        <w:pStyle w:val="Listenabsatz"/>
+      </w:pPr>
+      <w:r>
+        <w:t>[R34] Park, J. S., et al. (2023). Generative Agents: Interactive Simulacra of Human Behavior. Proceedings of UIST 2023. https://doi.org/10.1145/3586183.3606763</w:t>
+      </w:r>
+    </w:p>
+    <w:p>
+      <w:pPr>
+        <w:pStyle w:val="Listenabsatz"/>
+      </w:pPr>
+      <w:r>
+        <w:t>[R35] Argyle, L. P., et al. (2023). Out of One, Many: Using Language Models to Simulate Human Samples. Political Analysis, 31(3), 337-351. https://doi.org/10.1017/pan.2023.2</w:t>
+      </w:r>
+    </w:p>
+    <w:p>
+      <w:pPr>
+        <w:pStyle w:val="Listenabsatz"/>
+      </w:pPr>
+      <w:r>
+        <w:t>[R36] Oriol, M., et al. (2018). FAME: A Feedback Analytics Methodology for Continuous Requirements Engineering. IEEE International RE Conference (RE 2018). https://doi.org/10.1109/RE.2018.00052</w:t>
+      </w:r>
+    </w:p>
+    <w:p>
+      <w:pPr>
+        <w:pStyle w:val="Listenabsatz"/>
+      </w:pPr>
+      <w:r>
+        <w:t>[R37] Jimenez, C. E., et al. (2024). SWE-Bench: Can Language Models Resolve Real-World GitHub Issues? ICLR 2024. https://arxiv.org/abs/2310.06770</w:t>
+      </w:r>
+    </w:p>
+    <w:p>
+      <w:pPr>
+        <w:pStyle w:val="Listenabsatz"/>
+      </w:pPr>
+      <w:r>
+        <w:t>[R38] AWS. (2025). Statement on AI-generated code and operational issues. Amazon Web Services Official Account, X (formerly Twitter), 2025.</w:t>
+      </w:r>
+    </w:p>
+    <w:p>
+      <w:pPr>
         <w:rPr>
           <w:lang w:val="de-CH"/>
         </w:rPr>
@@ -10977,7 +11719,7 @@
           <w:sz w:val="20"/>
           <w:lang w:val="de-CH"/>
         </w:rPr>
-        <w:t xml:space="preserve">[TODO: Tags 09–14 Referenzen ergänzen </w:t>
+        <w:t>Tags 10-11 Referenzen ergaenzt: R24-R38 (13.06.2026). Tags 12-14 noch ausstehend.</w:t>
       </w:r>
       <w:proofErr w:type="gramStart"/>
       <w:r>
@@ -11609,6 +12351,54 @@
     </w:p>
     <w:p>
       <w:pPr>
+        <w:pStyle w:val="Listenabsatz"/>
+      </w:pPr>
+      <w:r>
+        <w:t>APR: Automated Program Repair – KI-gestützte automatisierte Fehlerbehebung in Software. Benchmark: SWE-Bench (Jimenez et al. 2024).  vgl. [R37]</w:t>
+      </w:r>
+    </w:p>
+    <w:p>
+      <w:pPr>
+        <w:pStyle w:val="Listenabsatz"/>
+      </w:pPr>
+      <w:r>
+        <w:t>MAPE-K: Monitor - Analyze - Plan - Execute + Knowledge – Steuerungsschleife fuer adaptive Systeme; Grundlage FAME-Framework fuer kontinuierliches RE.  vgl. [R36]</w:t>
+      </w:r>
+    </w:p>
+    <w:p>
+      <w:pPr>
+        <w:pStyle w:val="Listenabsatz"/>
+      </w:pPr>
+      <w:r>
+        <w:t>OWASP Top 10: Die zehn haeufigsten Web-Anwendungssicherheitsrisiken (Open Worldwide Application Security Project), u.a. Injection, XSS, IDOR.  vgl. [R28] Veracode 2025</w:t>
+      </w:r>
+    </w:p>
+    <w:p>
+      <w:pPr>
+        <w:pStyle w:val="Listenabsatz"/>
+      </w:pPr>
+      <w:r>
+        <w:t>SusAF: Sustainability Awareness Framework – analysiert Software-Systeme entlang 5 Nachhaltigkeitsdimensionen (Technisch, Sozial, Wirtschaftlich, OEkologisch, Individuell) auf 3 Ebenen (Immediate, Enabling, Systemic).  vgl. [R26] Becker et al.</w:t>
+      </w:r>
+    </w:p>
+    <w:p>
+      <w:pPr>
+        <w:pStyle w:val="Listenabsatz"/>
+      </w:pPr>
+      <w:r>
+        <w:t>SWE-Bench: Benchmark mit 2294 realen GitHub-Issues als Testfaelle fuer KI-basierte Software-Engineering-Assistenten (Jimenez et al. 2024).  vgl. [R37]</w:t>
+      </w:r>
+    </w:p>
+    <w:p>
+      <w:pPr>
+        <w:pStyle w:val="Listenabsatz"/>
+      </w:pPr>
+      <w:r>
+        <w:t>Silicon Sampling: Methode, bei der LLMs als Proxy fuer Bevoelkerungsgruppen eingesetzt werden, um Umfragen zu simulieren (Argyle et al. 2023).  vgl. [R35]</w:t>
+      </w:r>
+    </w:p>
+    <w:p>
+      <w:pPr>
         <w:rPr>
           <w:lang w:val="de-CH"/>
         </w:rPr>
@@ -12656,6 +13446,46 @@
           <w:lang w:val="de-CH"/>
         </w:rPr>
         <w:t>Value Stream Mapping</w:t>
+      </w:r>
+    </w:p>
+    <w:p>
+      <w:pPr>
+        <w:pStyle w:val="Listenabsatz"/>
+      </w:pPr>
+      <w:r>
+        <w:t>APR:	Automated Program Repair</w:t>
+      </w:r>
+    </w:p>
+    <w:p>
+      <w:pPr>
+        <w:pStyle w:val="Listenabsatz"/>
+      </w:pPr>
+      <w:r>
+        <w:t>MAPE-K:	Monitor-Analyze-Plan-Execute-Knowledge</w:t>
+      </w:r>
+    </w:p>
+    <w:p>
+      <w:pPr>
+        <w:pStyle w:val="Listenabsatz"/>
+      </w:pPr>
+      <w:r>
+        <w:t>OWASP:	Open Worldwide Application Security Project</w:t>
+      </w:r>
+    </w:p>
+    <w:p>
+      <w:pPr>
+        <w:pStyle w:val="Listenabsatz"/>
+      </w:pPr>
+      <w:r>
+        <w:t>SusAF:	Sustainability Awareness Framework</w:t>
+      </w:r>
+    </w:p>
+    <w:p>
+      <w:pPr>
+        <w:pStyle w:val="Listenabsatz"/>
+      </w:pPr>
+      <w:r>
+        <w:t>XSS:	Cross-Site Scripting</w:t>
       </w:r>
     </w:p>
     <w:p>

</xml_diff>

<commit_message>
feat: Agile Coaching Kontext in Thesis eingebettet (R39-R43)
Ergänzt basierend auf CAS-PN-AgileCoachingICT-LernendeCIT.pdf,
Chapter_Ausbildungsplaetze.docx und Rotationsplanung.xlsx:

- 1.1 Ausgangslage: IST-Prozess konkretisiert (Excel Rotationsplanung.xlsx,
  10 APs, manuelle x/o-Kompetenzmarkierung, keine Lückenerkennung)
- 1.2 Organisatorische Einbettung: CIT Kreisorganisation seit Sommer 2023
  (Zellstrukturdesign Pfläging & Hermann), Kreis Future, Chapter Ausbildungsplätze,
  10 APs mit Namen und Praxisbildner-Struktur
- 3.4 Einbezug Stakeholder: Agile Coaching PA 2024 als Vorphase benannt
  (Auftragskarussell, Riemann-Thomann, Kreis Future)
- Bibliografie: R39-R43 (Pfläging, Andresen, Fleisch, Kuhn 2024, CIT FHNW)
- Glossar: Zellstrukturdesign, Kreis Future, Praxisbildner, Chapter Ausbildungsplätze

Co-Authored-By: Claude Sonnet 4.6 <noreply@anthropic.com>
</commit_message>
<xml_diff>
--- a/doku/HKTracker_CAS_Abschlussarbeit_Entwurf_v01.docx
+++ b/doku/HKTracker_CAS_Abschlussarbeit_Entwurf_v01.docx
@@ -3267,6 +3267,14 @@
     </w:p>
     <w:p>
       <w:pPr>
+        <w:pStyle w:val="Aufzhlungszeichen"/>
+      </w:pPr>
+      <w:r>
+        <w:t>IST-Prozess (vor HK-Tracker): Rotationsplanung wurde als Excel-Datei (Rotationsplanung.xlsx) geführt: Übersichts-Tab mit allen Lernenden (ca. 15 Personen, Jahrgänge BI20–BI23, AE21–AE22, FI24, PE24/25) und ihren Ausbildungsplätzen pro Semester; je ein Tab pro Ausbildungsplatz (10 APs: SDM, SDO, SDW, WEB, COL, NetDC, EP, WE, CIS, PnD) mit Praxisbildner, Belegung und abzudeckenden Handlungskompetenzen. Kompetenzabdeckung wurde manuell markiert (x = abgedeckt, o = an anderem AP zu erfüllen); keine automatische Lückenerkennung.  vgl. [R43] CIT FHNW 2024</w:t>
+      </w:r>
+    </w:p>
+    <w:p>
+      <w:pPr>
         <w:rPr>
           <w:lang w:val="de-CH"/>
         </w:rPr>
@@ -3546,6 +3554,38 @@
     </w:p>
     <w:p>
       <w:pPr>
+        <w:pStyle w:val="Aufzhlungszeichen"/>
+      </w:pPr>
+      <w:r>
+        <w:t>Agile Organisationsstruktur CIT (seit Sommer 2023): Die Corporate IT FHNW stellte ihre Organisation auf Zellstrukturdesign (vgl. [R39] Pfläging &amp; Hermann 2020) um – dezentrale Kreise mit Selbstorganisation statt klassischer Hierarchie.</w:t>
+      </w:r>
+    </w:p>
+    <w:p>
+      <w:pPr>
+        <w:pStyle w:val="Aufzhlungszeichen"/>
+      </w:pPr>
+      <w:r>
+        <w:t>Kreis Future – Heimkreis der ICT-Lernenden: Rollen: Taskmaster (Lernende, per Wahl), Coach (Berufsbildner Iwo Kuhn), Kreismitglieder. Selbstorganisation durch agile Zeremonien (Sprint-Planung, Reviews, Retrospektiven).  vgl. [R42] Kuhn 2024</w:t>
+      </w:r>
+    </w:p>
+    <w:p>
+      <w:pPr>
+        <w:pStyle w:val="Aufzhlungszeichen"/>
+      </w:pPr>
+      <w:r>
+        <w:t>Chapter «Ausbildungsplätze» – Koordinationsgremium der Praxisbildner: Chapter Lead Iwo Kuhn; Zweck: Rotationskoordination (Semesterplanung), Kompetenz-Alignment zwischen APs, gegenseitige Unterstützung.  vgl. [R43] CIT FHNW 2024</w:t>
+      </w:r>
+    </w:p>
+    <w:p>
+      <w:pPr>
+        <w:pStyle w:val="Aufzhlungszeichen"/>
+      </w:pPr>
+      <w:r>
+        <w:t>CIT Ausbildungsplätze (10 APs): SDM (IT-Servicedesk Muttenz), SDO (IT-Servicedesk Olten), SDW (IT-Servicedesk Windisch), WEB (Webentwicklung), COL (Collaboration), NetDC (Network &amp; Datacenter), EP (Enterprise Platforms), WE (Workplace Engineering), CIS (Cloud Infrastructure Services), PnD (Protection and Design).</w:t>
+      </w:r>
+    </w:p>
+    <w:p>
+      <w:pPr>
         <w:rPr>
           <w:lang w:val="de-CH"/>
         </w:rPr>
@@ -8317,6 +8357,14 @@
     <w:p>
       <w:pPr>
         <w:pStyle w:val="Aufzhlungszeichen2"/>
+      </w:pPr>
+      <w:r>
+        <w:t>Agile Coaching Projektarbeit 2024 (Vorphase): Im Rahmen des CAS Agile Coaching (vgl. [R42] Kuhn 2024) wurde mit dem Kreis Future eine Stakeholder-Analyse mittels Auftragskarussell-Methode (vgl. [R40] Andresen 2019) und Riemann-Thomann-Modell (vgl. [R41] Fleisch 2022) durchgeführt. Ergebnis: Lernende äusserten explizit den Bedarf nach Transparenz über ihren HK-Fortschritt und über die Tätigkeiten an anderen APs – ein zentrales Nutzeranliegen, das den HK-Tracker motiviert.</w:t>
+      </w:r>
+    </w:p>
+    <w:p>
+      <w:pPr>
+        <w:pStyle w:val="Aufzhlungszeichen2"/>
         <w:rPr>
           <w:lang w:val="de-CH"/>
         </w:rPr>
@@ -11692,6 +11740,46 @@
     </w:p>
     <w:p>
       <w:pPr>
+        <w:pStyle w:val="Listenabsatz"/>
+      </w:pPr>
+      <w:r>
+        <w:t>[R39] Pfläging, N. &amp; Hermann, S. (2020). Zellstrukturdesign: Wie Organisationen Komplexität meistern. Verlag Franz Vahlen.</w:t>
+      </w:r>
+    </w:p>
+    <w:p>
+      <w:pPr>
+        <w:pStyle w:val="Listenabsatz"/>
+      </w:pPr>
+      <w:r>
+        <w:t>[R40] Andresen, J. (2019). Agiles Coaching: Die neue Art, Teams zum Erfolg zu führen. Carl Hanser Verlag.</w:t>
+      </w:r>
+    </w:p>
+    <w:p>
+      <w:pPr>
+        <w:pStyle w:val="Listenabsatz"/>
+      </w:pPr>
+      <w:r>
+        <w:t>[R41] Fleisch, N. (2022). Das Quartett der Persönlichkeit nach dem Riemann-Thomann-Modell. Haupt Verlag.</w:t>
+      </w:r>
+    </w:p>
+    <w:p>
+      <w:pPr>
+        <w:pStyle w:val="Listenabsatz"/>
+      </w:pPr>
+      <w:r>
+        <w:t>[R42] Kuhn, I. (2024). Agile Coaching ICT-Lernende CIT. Projektarbeit CAS Agile Coaching, FHNW Windisch (unveröffentlicht).</w:t>
+      </w:r>
+    </w:p>
+    <w:p>
+      <w:pPr>
+        <w:pStyle w:val="Listenabsatz"/>
+      </w:pPr>
+      <w:r>
+        <w:t>[R43] FHNW CIT (2024). Chapter «Ausbildungsplätze»: Konzept und Regelwerk. Internes Dokument, Corporate IT FHNW.</w:t>
+      </w:r>
+    </w:p>
+    <w:p>
+      <w:pPr>
         <w:rPr>
           <w:lang w:val="de-CH"/>
         </w:rPr>
@@ -11786,6 +11874,38 @@
           <w:lang w:val="de-CH"/>
         </w:rPr>
         <w:t>[Vorgabe] Alle wesentlichen Fachbegriffe präzise klären und korrekt verwenden (Bewertungskriterium).</w:t>
+      </w:r>
+    </w:p>
+    <w:p>
+      <w:pPr>
+        <w:pStyle w:val="Listenabsatz"/>
+      </w:pPr>
+      <w:r>
+        <w:t>Chapter «Ausbildungsplätze»: Koordinationsgremium der Praxisbildner in der CIT; verantwortlich für Rotationsplanung, HK-Abdeckungskoordination und gegenseitige Unterstützung; Chapter Lead: Iwo Kuhn.  vgl. [R43]</w:t>
+      </w:r>
+    </w:p>
+    <w:p>
+      <w:pPr>
+        <w:pStyle w:val="Listenabsatz"/>
+      </w:pPr>
+      <w:r>
+        <w:t>Kreis Future: ICT-Lernenden-Heimkreis in der CIT-Kreisorganisation; Selbstorganisation durch Taskmaster und Coach; agile Zeremonien (Sprint-Planung, Reviews, Retrospektiven). vgl. [R42]</w:t>
+      </w:r>
+    </w:p>
+    <w:p>
+      <w:pPr>
+        <w:pStyle w:val="Listenabsatz"/>
+      </w:pPr>
+      <w:r>
+        <w:t>Praxisbildner/in: Person, die Lernende an einem Ausbildungsplatz fachlich betreut (≠ Berufsbildner/in, der/die die Gesamtausbildung koordiniert und für das Lehrverhältnis verantwortlich ist).</w:t>
+      </w:r>
+    </w:p>
+    <w:p>
+      <w:pPr>
+        <w:pStyle w:val="Listenabsatz"/>
+      </w:pPr>
+      <w:r>
+        <w:t>Zellstrukturdesign: Organisationsmodell für Unternehmen in komplexen Umfeldern (Pfläging &amp; Hermann 2020) – dezentrale Kreise mit Selbstorganisation ersetzen klassische Hierarchie; CIT FHNW seit Sommer 2023.  vgl. [R39]</w:t>
       </w:r>
     </w:p>
     <w:p>

</xml_diff>

<commit_message>
feat: Kapitel 1 Einleitung – Fliesstext-Intro + R44/R45
- Ersetzt [Vorgabe]-Placeholder durch 4 Fliesstext-Absätze:
  Kontext ICT-Berufsbildung CH, SBFI Bildungspläne als Normrahmen,
  FHNW als Ausbildungsbetrieb (CIT), HK-Tracker als Lösung,
  Kapitelstruktur-Roadmap
- R44: ICT-Berufsbildung / SBFI Bildungsplan Informatiker EFZ
- R45: FHNW Berufsbildung (https://fhnw.ch/.../berufsbildung)

Co-Authored-By: Claude Sonnet 4.6 <noreply@anthropic.com>
</commit_message>
<xml_diff>
--- a/doku/HKTracker_CAS_Abschlussarbeit_Entwurf_v01.docx
+++ b/doku/HKTracker_CAS_Abschlussarbeit_Entwurf_v01.docx
@@ -3012,6 +3012,38 @@
     </w:p>
     <w:p>
       <w:pPr>
+        <w:pStyle w:val="Standard"/>
+      </w:pPr>
+      <w:r>
+        <w:t>Die Schweizer Berufsbildung im ICT-Bereich verpflichtet Ausbildungsbetriebe, Lernende zu einem breiten Spektrum von Handlungskompetenzen (HK) zu befähigen. Die dafür massgeblichen Kompetenzziele sind in den Bildungsplänen des Staatssekretariats für Bildung, Forschung und Innovation (SBFI) verbindlich festgelegt und strukturieren die betriebliche Grundbildung in den Berufen Informatiker/in EFZ und ICT-Fachmann/-frau EFZ. vgl. [R44] ICT-Berufsbildung / SBFI 2021</w:t>
+      </w:r>
+    </w:p>
+    <w:p>
+      <w:pPr>
+        <w:pStyle w:val="Standard"/>
+      </w:pPr>
+      <w:r>
+        <w:t>Die Fachhochschule Nordwestschweiz (FHNW) bildet als Ausbildungsbetrieb an mehreren Standorten ICT-Lernende aus – darunter in der Corporate IT (CIT) in Windisch, Olten und Muttenz. vgl. [R45] FHNW Berufsbildung  Berufsbildner und Praxisbildner begleiten die Lernenden dabei fachlich, koordinieren deren Rotation durch verschiedene Ausbildungsplätze und beurteilen die erbrachten Kompetenznachweise anhand der Bloom-Taxonomie. Die Dokumentation dieser Kompetenzen erfolgte bislang vollständig manuell – in Excel-Tabellen und Word-Dokumenten – ohne standardisierte digitale Unterstützung und ohne automatisierte Erkennung von Abdeckungslücken im Bildungsplan.</w:t>
+      </w:r>
+    </w:p>
+    <w:p>
+      <w:pPr>
+        <w:pStyle w:val="Standard"/>
+      </w:pPr>
+      <w:r>
+        <w:t>Die vorliegende Abschlussarbeit beschreibt Konzeption, Entwicklung und Pilotbetrieb des HK-Trackers: einer webbasierten Applikation, die Kompetenzerfassung, Bloom-taxonomie-basierte Bewertung, Ausbildungsplatz-Rotation und HK-Abdeckungsanalyse digital unterstützt und durch den Einsatz von KI (Azure OpenAI GPT-4o) schrittweise automatisiert. Claude Code – das KI-gestützte Entwicklungswerkzeug von Anthropic – kommt dabei als zentrales Hilfsmittel im Entwicklungsprozess selbst zum Einsatz.</w:t>
+      </w:r>
+    </w:p>
+    <w:p>
+      <w:pPr>
+        <w:pStyle w:val="Standard"/>
+      </w:pPr>
+      <w:r>
+        <w:t>Die Einleitung gliedert sich in Ausgangslage und Problemstellung (1.1), organisatorische Einbettung der CIT FHNW (1.2), KI-bezogene Unternehmens- und Projektziele (1.3) sowie Stakeholder- und Kontextanalyse (1.4).</w:t>
+      </w:r>
+    </w:p>
+    <w:p>
+      <w:pPr>
         <w:pStyle w:val="berschrift2"/>
         <w:rPr>
           <w:lang w:val="de-CH"/>
@@ -11776,6 +11808,22 @@
       </w:pPr>
       <w:r>
         <w:t>[R43] FHNW CIT (2024). Chapter «Ausbildungsplätze»: Konzept und Regelwerk. Internes Dokument, Corporate IT FHNW.</w:t>
+      </w:r>
+    </w:p>
+    <w:p>
+      <w:pPr>
+        <w:pStyle w:val="Listenabsatz"/>
+      </w:pPr>
+      <w:r>
+        <w:t>[R44] ICT-Berufsbildung Schweiz / SBFI. (2021). Bildungsplan Informatikerin EFZ / Informatiker EFZ (Fachrichtung Betriebsinformatik und Applikationsentwicklung). Staatssekretariat für Bildung, Forschung und Innovation. https://www.ict-berufsbildung.ch/grundbildung/ict-lehren/informatiker-in-efz/</w:t>
+      </w:r>
+    </w:p>
+    <w:p>
+      <w:pPr>
+        <w:pStyle w:val="Listenabsatz"/>
+      </w:pPr>
+      <w:r>
+        <w:t>[R45] FHNW. (o. J.). Berufsbildung – Lernende und Karriere. Fachhochschule Nordwestschweiz. https://www.fhnw.ch/de/die-fhnw/karriere/berufsbildung</w:t>
       </w:r>
     </w:p>
     <w:p>

</xml_diff>

<commit_message>
feat: 1.1 Ausgangslage – Fliesstext Problemschilderung
Drei Fliesstext-Absätze ergänzt (nach [Vorgabe]-Placeholder,
vor bestehenden Bullet-Points):

1. Praxisbildner: IT-Spezialisten mit begrenzten pädagogischen
   Ressourcen; Kompetenzbeurteilung tritt gegenüber IT-Betrieb zurück
2. Lernende: Dokumentationspflicht vs. IT-Affinität; Beurteilung
   oft erst kurz vor Terminen, nicht prozessbegleitend
3. Transparenzlücken: AP-Kompetenzmatrix (Excel, kaum genutzt),
   Rotationsplanung (Excel), fehlender Wissenstransfer beim AP-Wechsel

Co-Authored-By: Claude Sonnet 4.6 <noreply@anthropic.com>
</commit_message>
<xml_diff>
--- a/doku/HKTracker_CAS_Abschlussarbeit_Entwurf_v01.docx
+++ b/doku/HKTracker_CAS_Abschlussarbeit_Entwurf_v01.docx
@@ -3119,6 +3119,30 @@
           <w:sz w:val="20"/>
         </w:rPr>
         <w:t xml:space="preserve"> adressiert, was nicht?</w:t>
+      </w:r>
+    </w:p>
+    <w:p>
+      <w:pPr>
+        <w:pStyle w:val="Standard"/>
+      </w:pPr>
+      <w:r>
+        <w:t>Die Praxisbildner an den CIT-Ausbildungsplätzen sind in erster Linie Fachspezialisten in ihren jeweiligen IT-Bereichen – sei es Netzwerk, Cloud-Infrastruktur, Webentwicklung oder Collaboration – und betreuen Lernende neben ihrer regulären Arbeit. Für eine fundierte Kompetenzbeurteilung nach Bloom-Taxonomie fehlt ihnen häufig sowohl die pädagogische Ausbildung als auch die zeitlichen Ressourcen. Die Beurteilung von Handlungskompetenzen ist damit eine Aufgabe, die zwar verpflichtend ist, im Arbeitsalltag aber regelmässig gegenüber dem operativen IT-Betrieb zurücktritt.</w:t>
+      </w:r>
+    </w:p>
+    <w:p>
+      <w:pPr>
+        <w:pStyle w:val="Standard"/>
+      </w:pPr>
+      <w:r>
+        <w:t>Auch auf Seiten der Lernenden besteht eine strukturelle Herausforderung: Lernende bevorzugen verständlicherweise die praktische IT-Arbeit gegenüber der administrativen Dokumentation ihres Kompetenzfortschritts. Dabei sind sie gemäss den Vorgaben des Bildungsplans verpflichtet, ihre Handlungskompetenzen eigenständig nachzuweisen und kontinuierlich zu dokumentieren. In der Praxis geschieht dies oft erst unmittelbar vor Beurteilungsterminen und bleibt damit punktuell statt prozessbegleitend.</w:t>
+      </w:r>
+    </w:p>
+    <w:p>
+      <w:pPr>
+        <w:pStyle w:val="Standard"/>
+      </w:pPr>
+      <w:r>
+        <w:t>Erschwerend wirken strukturelle Transparenzlücken auf mehreren Ebenen: Welche Handlungskompetenzen an welchem Ausbildungsplatz erworben werden können, ist zwar in einer Excel-Datei erfasst, wird im Alltag jedoch kaum konsultiert. Die Rotation der Lernenden zwischen den zehn CIT-Ausbildungsplätzen wird ebenfalls über eine Excel-Tabelle koordiniert – mit entsprechend eingeschränkter Übersicht über Abdeckungslücken oder Planungskonflikte. Wenn Lernende den Ausbildungsplatz wechseln, steht dem aufnehmenden Praxisbildner keine strukturierte Übersicht zur Verfügung, welche Kompetenzen bereits nachgewiesen wurden und welche Arbeiten dazu beigetragen haben. Diese Information wäre jedoch entscheidend, um die Einarbeitung gezielt auf bestehende Lücken auszurichten und eine nahtlose Weiterführung der Kompetenzentwicklung zu gewährleisten.</w:t>
       </w:r>
     </w:p>
     <w:p>

</xml_diff>

<commit_message>
feat: 1.2 Organisatorische Einbettung – Fliesstext aus Organigramm + Chapter-Konstitution
Drei Fliesstext-Absätze basierend auf CIT-Organigramm und Chapter-Konstitution:
1. CIT als Zellstrukturdesign-Organisation seit Sommer 2023;
   Leiter CIT + People Manager als Führungsebene; Verweis Abbildung A.1
2. Zwei Kreistypen: Peripheriekreise (10 IT-APs) + Zentrumskreise;
   Kreis Future = Lernenden-Heimkreis (Entwicklung, Kompetenzerweiterung,
   Anlassorganisation, Kommunikation)
3. Chapter AUP (CP-AUP, Iwo Kuhn): Koordination aller Praxisbildner;
   Chapter-Konstitution fordert 'High-Level Sicht Kompetenzfortschritte'
   → HK-Tracker als digitale Lösung genau dafür
Organigramm-TODO zu Abbildungsreferenz aktualisiert.

Co-Authored-By: Claude Sonnet 4.6 <noreply@anthropic.com>
</commit_message>
<xml_diff>
--- a/doku/HKTracker_CAS_Abschlussarbeit_Entwurf_v01.docx
+++ b/doku/HKTracker_CAS_Abschlussarbeit_Entwurf_v01.docx
@@ -3409,6 +3409,30 @@
     </w:p>
     <w:p>
       <w:pPr>
+        <w:pStyle w:val="Standard"/>
+      </w:pPr>
+      <w:r>
+        <w:t>Die Corporate IT (CIT) der FHNW ist die organisatorische Heimat des HK-Trackers. Seit Sommer 2023 operiert die CIT nach dem Prinzip des Zellstrukturdesigns (vgl. [R39] Pfläging &amp; Hermann 2020): Anstelle einer klassischen Hierarchie besteht die Organisation aus dezentralen, selbstorganisierten Kreisen. Der Leiter CIT und die People Manager*in übernehmen übergreifende Führungs- und Personalaufgaben, während Betrieb und Wertschöpfung in den Kreisen selbst verantwortet werden (vgl. CIT-Organigramm, Abbildung A.1 im Anhang).</w:t>
+      </w:r>
+    </w:p>
+    <w:p>
+      <w:pPr>
+        <w:pStyle w:val="Standard"/>
+      </w:pPr>
+      <w:r>
+        <w:t>Das CIT-Organigramm unterscheidet zwei Kreis-Typen: Peripheriekreise erbringen direkte IT-Dienstleistungen für die FHNW – darunter Workplace Engineering, Cloud Infrastructure Services, Collaboration, Enterprise Platforms, Software Engineering, Web, Network &amp; Datacenter, Protection &amp; Design sowie vier IT-Servicedesk-Standorte (Windisch, Brugg, Muttenz, Olten). Zentrumskreise unterstützen interne Belange der CIT: People &amp; Culture, Strategy &amp; Business Alignment – und Kreis Future, der Heimkreis der ICT-Lernenden. Kreis Future ist verantwortlich für die Entwicklung der Lernenden zu Fachpersonen, Kompetenzerweiterung, gegenseitige Unterstützung, Anlassorganisation und Kommunikation unter den Lernenden (vgl. [R42] Kuhn 2024).</w:t>
+      </w:r>
+    </w:p>
+    <w:p>
+      <w:pPr>
+        <w:pStyle w:val="Standard"/>
+      </w:pPr>
+      <w:r>
+        <w:t>Ergänzend zu den Kreisen koordinieren Chapters themenübergreifende Aufgaben innerhalb der CIT. Das Chapter «Ausbildungsplätze» (Kürzel: CP-AUP, Chapter Lead: Iwo Kuhn) vernetzt alle Praxisbildner über die Kreisgrenzen hinweg: Rotationskoordination, Kompetenz-Alignment zwischen den zehn Ausbildungsplätzen, gegenseitige Unterstützung sowie – ausdrücklich in der Chapter-Konstitution festgehalten – die Bereitstellung einer «High-Level Sicht zu den individuellen Kompetenzfortschritten» für die aktiven Praxisbildner (vgl. [R43] CIT FHNW 2024). Der HK-Tracker ist das digitale Werkzeug, das diesen in der Konstitution beschriebenen Bedarf erstmals systematisch adressiert.</w:t>
+      </w:r>
+    </w:p>
+    <w:p>
+      <w:pPr>
         <w:pStyle w:val="Aufzhlungszeichen"/>
         <w:rPr>
           <w:lang w:val="de-CH"/>
@@ -3653,7 +3677,7 @@
           <w:sz w:val="20"/>
           <w:lang w:val="de-CH"/>
         </w:rPr>
-        <w:t>[TODO: Organigramm FHNW Berufsbildung als Abbildung einfügen (Anhang A)]</w:t>
+        <w:t>[Abbildung A.1: CIT-Organigramm – siehe Anhang/Organigramm.pdf]</w:t>
       </w:r>
     </w:p>
     <w:p>

</xml_diff>

<commit_message>
feat: 1.3 KI-Projektziele – Fliesstext AI-Strategie CIT + R46/R47
Drei Fliesstext-Absätze basierend auf AI-Reiseplan (28.04.2026) und CAS AI-SE:
1. CIT AI-Strategie: 6 Leitthesen aus Workshop (Wissensarbeit ändert sich
   fundamental, FHNW erwartet zukunftsfähige IT, Wildwuchs ohne Rahmen,
   Rollen verschieben sich, Lernkultur entscheidend, Transformation passiert
   sowieso); Chapter AI als org. Anker (Elsener/Grässle)
2. CAS AI-SE: ca. 6 CIT-Mitarbeitende (12 ECTS, 14 Kurstage);
   HK-Tracker als direktes Thesis-Produkt und Lernfeld KI-Transformation
3. Überleitung zu den 4 KI-Projektzielen (bestehende Bullets)
R46: FHNW CAS AI-SE; R47: AI-Reiseplan CIT (internes Dokument)

Co-Authored-By: Claude Sonnet 4.6 <noreply@anthropic.com>
</commit_message>
<xml_diff>
--- a/doku/HKTracker_CAS_Abschlussarbeit_Entwurf_v01.docx
+++ b/doku/HKTracker_CAS_Abschlussarbeit_Entwurf_v01.docx
@@ -3778,6 +3778,30 @@
     </w:p>
     <w:p>
       <w:pPr>
+        <w:pStyle w:val="Standard"/>
+      </w:pPr>
+      <w:r>
+        <w:t>Künstliche Intelligenz ist für die Corporate IT FHNW kein peripheres Trendthema, sondern ein strategischer Transformationstreiber. In einem internen Workshop im April 2026 erarbeitete die CIT sechs Leitthesen, warum sie sich mit und durch KI entwickeln muss (vgl. AI-Reiseplan CIT, Abbildung A.2 im Anhang; [R47]): Wissensarbeit verändert sich fundamental – KI verändert nicht einzelne Tools, sondern die Art, wie Analyse, Entscheidung und Problemlösung funktionieren. Die FHNW erwartet als Bildungs- und Forschungsinstitution eine zukunftsfähige IT. Ohne bewusste Gestaltung entsteht Wildwuchs – AI-Tools werden bereits genutzt, mit oder ohne Rahmen. Rollen und Verantwortlichkeiten verschieben sich, und die CIT muss klären, welche Kompetenzen künftig gefragt sind. Zusammenarbeit und Lernkultur sind entscheidend: Experimentieren und gemeinsames Lernen müssen möglich sein. Und schliesslich: Die Transformation geschieht sowieso – Passivität ist keine neutrale Option. Organisatorisch ist KI in der CIT durch das Chapter AI (Chapter Leads: Nicola Elsener, Oliver Grässle) verankert (vgl. CIT-Organigramm, Abbildung A.1).</w:t>
+      </w:r>
+    </w:p>
+    <w:p>
+      <w:pPr>
+        <w:pStyle w:val="Standard"/>
+      </w:pPr>
+      <w:r>
+        <w:t>Als konkrete Upskilling-Massnahme besuchen rund sechs Mitarbeitende der CIT das Certificate of Advanced Studies «Künstliche Intelligenz für Softwareentwicklung» (CAS AI-SE) an der FHNW Hochschule für Informatik – 12 ECTS, 14 Kurstage, mit Fokus auf KI-Einsatz in Requirements Engineering, Architektur, Entwicklung, Testing und Betrieb (vgl. [R46] FHNW 2026). Die vorliegende Abschlussarbeit ist ein direktes Ergebnis dieses CAS: Der HK-Tracker wird nicht nur als Praxisprojekt entwickelt, sondern dient gleichzeitig als konkretes Lernfeld für den produktiven KI-Einsatz in der eigenen Organisation – und damit als Beitrag zur KI-Transformation der CIT.</w:t>
+      </w:r>
+    </w:p>
+    <w:p>
+      <w:pPr>
+        <w:pStyle w:val="Standard"/>
+      </w:pPr>
+      <w:r>
+        <w:t>Aus diesem strategischen Rahmen leiten sich die KI-bezogenen Projektziele des HK-Trackers direkt ab:</w:t>
+      </w:r>
+    </w:p>
+    <w:p>
+      <w:pPr>
         <w:pStyle w:val="Aufzhlungszeichen"/>
         <w:rPr>
           <w:lang w:val="de-CH"/>
@@ -11872,6 +11896,22 @@
       </w:pPr>
       <w:r>
         <w:t>[R45] FHNW. (o. J.). Berufsbildung – Lernende und Karriere. Fachhochschule Nordwestschweiz. https://www.fhnw.ch/de/die-fhnw/karriere/berufsbildung</w:t>
+      </w:r>
+    </w:p>
+    <w:p>
+      <w:pPr>
+        <w:pStyle w:val="Listenabsatz"/>
+      </w:pPr>
+      <w:r>
+        <w:t>[R46] FHNW. (2026). CAS Künstliche Intelligenz für Softwareentwicklung (AI-SE). Hochschule für Informatik, Fachhochschule Nordwestschweiz. https://www.fhnw.ch/de/informatik/weiterbildung/angebot/weiterbildungen/cas-artificial-intelligence-software-engineering</w:t>
+      </w:r>
+    </w:p>
+    <w:p>
+      <w:pPr>
+        <w:pStyle w:val="Listenabsatz"/>
+      </w:pPr>
+      <w:r>
+        <w:t>[R47] CIT FHNW. (2026, 28. April). AI-Reiseplan CIT – Workshop-Folie: Warum muss sich die CIT mit und durch KI entwickeln? Internes Dokument, Corporate IT FHNW.</w:t>
       </w:r>
     </w:p>
     <w:p>

</xml_diff>

<commit_message>
feat: 1.4 Stakeholder + 1.4.1 Personas – Seyff Tag 11 + Double-Role + R48
1.4 Fliesstext-Intro: RAM-Methodik (Gorschek & Wohlin), 4 Stakeholder-
Gruppen benannt, Überleitung zu Cooper-Personas in 1.4.1

Stakeholder 2 – Berufsbildner: Double-Role ergänzt (Iwo Kuhn = Entwickler
UND Primärnutzer → direkte Requirements-Validierung); langjährige Erfahrung
als Chapter Lead CP-AUP + Coach Kreis Future (vgl. [R42] Kuhn 2024)

1.4.1 Personas: Persona Engine-Hinweis nach Seyff Tag 11 und Patkar & Seyff
REFSQ 2023 ([R24]/[R48]); Abbildung A.3 (HK-Tracker-Personas.png) referenziert;
MPD → DDPD Evolutionspfad beschrieben ('created, validated, evolved')

R48: Seyff, N. (2026). Von klassischen Personas zu lebenden Nutzermodellen.
Folien CAS AI-SE Tag 11, FHNW.

Co-Authored-By: Claude Sonnet 4.6 <noreply@anthropic.com>
</commit_message>
<xml_diff>
--- a/doku/HKTracker_CAS_Abschlussarbeit_Entwurf_v01.docx
+++ b/doku/HKTracker_CAS_Abschlussarbeit_Entwurf_v01.docx
@@ -4233,6 +4233,14 @@
     </w:p>
     <w:p>
       <w:pPr>
+        <w:pStyle w:val="Standard"/>
+      </w:pPr>
+      <w:r>
+        <w:t>Die Stakeholder-Analyse strukturiert die Interessengruppen des HK-Trackers nach dem Requirements Abstraction Model (RAM) von Gorschek &amp; Wohlin (2006), das von Business Goals über System Goals bis zu technischen Constraints schichtet (vgl. [R05]). Vier Stakeholder-Gruppen wurden identifiziert: Lernende als direkte Endnutzer der Kompetenzerfassungs-Funktion; Berufsbildner als Primärnutzer mit Bewertungs- und Planungsverantwortung; Praxisbildner als dezentrale Betreuer an den einzelnen Ausbildungsplätzen; sowie die FHNW IT-Abteilung als Deployment- und Infrastruktur-Stakeholder. Die Nutzerprofile der drei operativen Gruppen werden in Abschnitt 1.4.1 als Cooper-Personas (zielorientiert) vertieft.</w:t>
+      </w:r>
+    </w:p>
+    <w:p>
+      <w:pPr>
         <w:pStyle w:val="Aufzhlungszeichen"/>
       </w:pPr>
       <w:r>
@@ -4406,6 +4414,14 @@
     </w:p>
     <w:p>
       <w:pPr>
+        <w:pStyle w:val="Aufzhlungszeichen2"/>
+      </w:pPr>
+      <w:r>
+        <w:t>Besonderheit: Der Berufsbildner (Iwo Kuhn) ist gleichzeitig Entwickler des HK-Trackers. Diese Double-Role ermöglicht direkte Requirements-Validierung aus der Nutzerperspektive. Er bringt langjährige Erfahrung als Berufsbildner, Chapter Lead CP-AUP und Coach des Kreis Future mit – dokumentiert in der CAS Agile Coaching Projektarbeit 2024 (vgl. [R42] Kuhn 2024).</w:t>
+      </w:r>
+    </w:p>
+    <w:p>
+      <w:pPr>
         <w:rPr>
           <w:lang w:val="de-CH"/>
         </w:rPr>
@@ -4968,6 +4984,14 @@
         <w:pStyle w:val="Standard"/>
       </w:pPr>
       <w:r>
+        <w:t>Die vier Personas sind als visuelle Übersicht in Abbildung A.3 (Anhang) dokumentiert. Methodisch entsprechen sie aktuell dem Typ «Manual Persona Development» (MPD) – erstellt aus direkter Beobachtung und Erfahrung, nicht aus aggregierten Laufzeitdaten. Gemäss dem «Persona Engine»-Konzept (vgl. [R24] Patkar &amp; Seyff, REFSQ 2023; [R48] Seyff, Tag 11 2026) sollen die Personas im Pilotbetrieb (Phase 3) durch strukturierte Feedback- und Monitoring-Daten validiert und schrittweise zu datengetriebenen Profilen weiterentwickelt werden – «created, validated, evolved» statt «created, never validated, never evolved».</w:t>
+      </w:r>
+    </w:p>
+    <w:p>
+      <w:pPr>
+        <w:pStyle w:val="Standard"/>
+      </w:pPr>
+      <w:r>
         <w:t/>
       </w:r>
     </w:p>
@@ -11912,6 +11936,14 @@
       </w:pPr>
       <w:r>
         <w:t>[R47] CIT FHNW. (2026, 28. April). AI-Reiseplan CIT – Workshop-Folie: Warum muss sich die CIT mit und durch KI entwickeln? Internes Dokument, Corporate IT FHNW.</w:t>
+      </w:r>
+    </w:p>
+    <w:p>
+      <w:pPr>
+        <w:pStyle w:val="Listenabsatz"/>
+      </w:pPr>
+      <w:r>
+        <w:t>[R48] Seyff, N. (2026, 12. Juni). Von klassischen Personas zu lebenden Nutzermodellen – Nutzerverständnis im Wandel der Software-Evolution. Vorlesungsfolien CAS AI-SE, Modultag 11. FHNW Hochschule für Informatik.</w:t>
       </w:r>
     </w:p>
     <w:p>

</xml_diff>

<commit_message>
feat: Kapitel 2.2 KI-Einsatz – Reorder KI1-5, neue Use Cases
- Claude Code zu KI 1 (existenzielle Voraussetzung, nicht nur Tool)
- Azure OpenAI → KI 2, Embeddings → KI 3 (physische Umsortierung im Dokument)
- Fliesstext-Intro: Nummerierung nach Bedeutungsrangfolge erklärt
- KI 4 (neu): Basisdaten-Import – Bildungspläne PDF + AP-Kompetenzen XLSX
- KI 5 (neu): Dokumentenbeurteilung – vollständig implementiert in
  AiEvaluationService.cs (POST /ai-evaluate, GPT-4o, Human-in-the-Loop)
- Bibliografie R50: SBFI Bildungsplan Informatiker EFZ

Co-Authored-By: Claude Sonnet 4.6 <noreply@anthropic.com>
</commit_message>
<xml_diff>
--- a/doku/HKTracker_CAS_Abschlussarbeit_Entwurf_v01.docx
+++ b/doku/HKTracker_CAS_Abschlussarbeit_Entwurf_v01.docx
@@ -5795,6 +5795,14 @@
     </w:p>
     <w:p>
       <w:pPr>
+        <w:pStyle w:val="Standard"/>
+      </w:pPr>
+      <w:r>
+        <w:t>Der HK-Tracker setzt KI an fünf strategisch unterschiedlichen Stellen ein. Die Nummerierung folgt der Bedeutungsrangfolge, nicht der chronologischen Einführungsreihenfolge: KI 1 – Claude Code – nimmt eine Sonderstellung ein, weil sie nicht als optionale Erweiterung zum Projekt hinzukommt, sondern als existenzielle Grundvoraussetzung gilt: Ohne KI-gestützte Softwareentwicklung gäbe es dieses Projekt nicht. KI 2 bis KI 5 sind In-App-Intelligenzfunktionen, die den Nutzern direkt zugutekommen – von der Kompetenzbeurteilung über die Datengrundlage bis zur Dokumentenanalyse.</w:t>
+      </w:r>
+    </w:p>
+    <w:p>
+      <w:pPr>
         <w:pStyle w:val="Aufzhlungszeichen"/>
         <w:rPr>
           <w:lang w:val="de-CH"/>
@@ -5804,15 +5812,14 @@
         <w:rPr>
           <w:lang w:val="de-CH"/>
         </w:rPr>
-        <w:lastRenderedPageBreak/>
-        <w:t>KI 1: Azure OpenAI (GPT-4o) – Bloom-Taxonomie-</w:t>
+        <w:t xml:space="preserve">KI 1: Claude Code (Anthropic) als KI-gestütztes </w:t>
       </w:r>
       <w:proofErr w:type="gramStart"/>
       <w:r>
         <w:rPr>
           <w:lang w:val="de-CH"/>
         </w:rPr>
-        <w:t>Erkennung</w:t>
+        <w:t>Entwicklungswerkzeug</w:t>
       </w:r>
       <w:r>
         <w:rPr>
@@ -5831,9 +5838,78 @@
           <w:sz w:val="20"/>
           <w:lang w:val="de-CH"/>
         </w:rPr>
-        <w:t xml:space="preserve"> [R10] Abrahamsson et al. 2025; Tag 08 </w:t>
-      </w:r>
+        <w:t xml:space="preserve"> Tag 02 RARIX 4-Layer / Tag 01 SDD</w:t>
+      </w:r>
+    </w:p>
+    <w:p>
+      <w:pPr>
+        <w:pStyle w:val="Aufzhlungszeichen2"/>
+      </w:pPr>
+      <w:r>
+        <w:t>Enabler-Rolle (sine qua non): Der Berufsbildner und Projektverantwortliche verfügt über kein aktives Programmier-Knowhow. Claude Code ermöglicht ihm als Domain-Experten, eine professionelle Full-Stack-Webapplikation (React/TypeScript + ASP.NET Core + SQL Server + Azure) zu realisieren. Ohne KI wäre dieses Projekt strukturell unmöglich – die App würde nicht existieren. Claude Code ist damit keine Effizienzsteigerung, sondern die Voraussetzung für die Existenz des Projekts.</w:t>
+      </w:r>
+    </w:p>
+    <w:p>
+      <w:pPr>
+        <w:pStyle w:val="Aufzhlungszeichen2"/>
+        <w:rPr>
+          <w:lang w:val="de-CH"/>
+        </w:rPr>
+      </w:pPr>
+      <w:r>
+        <w:rPr>
+          <w:lang w:val="de-CH"/>
+        </w:rPr>
+        <w:t>Einsatz: Spezifikationsgetriebene Weiterentwicklung (SDD-Prinzip)</w:t>
+      </w:r>
+    </w:p>
+    <w:p>
+      <w:pPr>
+        <w:pStyle w:val="Aufzhlungszeichen2"/>
+      </w:pPr>
       <w:proofErr w:type="spellStart"/>
+      <w:r>
+        <w:t>Qualitätssicherung</w:t>
+      </w:r>
+      <w:proofErr w:type="spellEnd"/>
+      <w:r>
+        <w:t>: Hooks &amp; Harnesses (ESLint, Tests)</w:t>
+      </w:r>
+    </w:p>
+    <w:p>
+      <w:pPr>
+        <w:pStyle w:val="Aufzhlungszeichen2"/>
+        <w:rPr>
+          <w:lang w:val="de-CH"/>
+        </w:rPr>
+      </w:pPr>
+      <w:r>
+        <w:rPr>
+          <w:lang w:val="de-CH"/>
+        </w:rPr>
+        <w:t>Dokumentation: arc42-Architektur, ADRs via MADR v4</w:t>
+      </w:r>
+    </w:p>
+    <w:p>
+      <w:pPr>
+        <w:pStyle w:val="Aufzhlungszeichen"/>
+        <w:rPr>
+          <w:lang w:val="de-CH"/>
+        </w:rPr>
+      </w:pPr>
+      <w:r>
+        <w:rPr>
+          <w:lang w:val="de-CH"/>
+        </w:rPr>
+        <w:t>KI 2: Azure OpenAI (GPT-4o) – Bloom-Taxonomie-</w:t>
+      </w:r>
+      <w:proofErr w:type="gramStart"/>
+      <w:r>
+        <w:rPr>
+          <w:lang w:val="de-CH"/>
+        </w:rPr>
+        <w:t>Erkennung</w:t>
+      </w:r>
       <w:r>
         <w:rPr>
           <w:i/>
@@ -5841,9 +5917,9 @@
           <w:sz w:val="20"/>
           <w:lang w:val="de-CH"/>
         </w:rPr>
-        <w:t>Agentic</w:t>
-      </w:r>
-      <w:proofErr w:type="spellEnd"/>
+        <w:t xml:space="preserve">  vgl.</w:t>
+      </w:r>
+      <w:proofErr w:type="gramEnd"/>
       <w:r>
         <w:rPr>
           <w:i/>
@@ -5851,106 +5927,9 @@
           <w:sz w:val="20"/>
           <w:lang w:val="de-CH"/>
         </w:rPr>
-        <w:t xml:space="preserve"> AI Sicherheitsregeln</w:t>
-      </w:r>
-    </w:p>
-    <w:p>
-      <w:pPr>
-        <w:pStyle w:val="Aufzhlungszeichen2"/>
-      </w:pPr>
-      <w:r>
-        <w:t xml:space="preserve">Input: </w:t>
+        <w:t xml:space="preserve"> [R10] Abrahamsson et al. 2025; Tag 08 </w:t>
       </w:r>
       <w:proofErr w:type="spellStart"/>
-      <w:r>
-        <w:t>Freitext-Kompetenznachweis</w:t>
-      </w:r>
-      <w:proofErr w:type="spellEnd"/>
-      <w:r>
-        <w:t xml:space="preserve"> des </w:t>
-      </w:r>
-      <w:proofErr w:type="spellStart"/>
-      <w:r>
-        <w:t>Lernenden</w:t>
-      </w:r>
-      <w:proofErr w:type="spellEnd"/>
-    </w:p>
-    <w:p>
-      <w:pPr>
-        <w:pStyle w:val="Aufzhlungszeichen2"/>
-        <w:rPr>
-          <w:lang w:val="de-CH"/>
-        </w:rPr>
-      </w:pPr>
-      <w:r>
-        <w:rPr>
-          <w:lang w:val="de-CH"/>
-        </w:rPr>
-        <w:t>Output: Bloom-Stufe K1–K6 + Begründung + Konfidenzwert</w:t>
-      </w:r>
-    </w:p>
-    <w:p>
-      <w:pPr>
-        <w:pStyle w:val="Aufzhlungszeichen2"/>
-        <w:rPr>
-          <w:lang w:val="de-CH"/>
-        </w:rPr>
-      </w:pPr>
-      <w:r>
-        <w:rPr>
-          <w:lang w:val="de-CH"/>
-        </w:rPr>
-        <w:t>Prompt-Design: Few-Shot mit Bloom-Beispielen aus Bildungsplan EFZ</w:t>
-      </w:r>
-    </w:p>
-    <w:p>
-      <w:pPr>
-        <w:pStyle w:val="Aufzhlungszeichen2"/>
-        <w:rPr>
-          <w:lang w:val="de-CH"/>
-        </w:rPr>
-      </w:pPr>
-      <w:r>
-        <w:rPr>
-          <w:lang w:val="de-CH"/>
-        </w:rPr>
-        <w:t>Menschliche Kontrolle: Berufsbildner muss KI-Vorschlag explizit bestätigen</w:t>
-      </w:r>
-    </w:p>
-    <w:p>
-      <w:pPr>
-        <w:pStyle w:val="Aufzhlungszeichen"/>
-        <w:rPr>
-          <w:lang w:val="de-CH"/>
-        </w:rPr>
-      </w:pPr>
-      <w:r>
-        <w:rPr>
-          <w:lang w:val="de-CH"/>
-        </w:rPr>
-        <w:t xml:space="preserve">KI 2: Embedding-basierte Ähnlichkeitssuche (Azure OpenAI </w:t>
-      </w:r>
-      <w:proofErr w:type="spellStart"/>
-      <w:r>
-        <w:rPr>
-          <w:lang w:val="de-CH"/>
-        </w:rPr>
-        <w:t>Embeddings</w:t>
-      </w:r>
-      <w:proofErr w:type="spellEnd"/>
-      <w:r>
-        <w:rPr>
-          <w:lang w:val="de-CH"/>
-        </w:rPr>
-        <w:t xml:space="preserve"> + </w:t>
-      </w:r>
-      <w:proofErr w:type="gramStart"/>
-      <w:r>
-        <w:rPr>
-          <w:lang w:val="de-CH"/>
-        </w:rPr>
-        <w:t>Vektordatenbank)</w:t>
-      </w:r>
       <w:r>
         <w:rPr>
           <w:i/>
@@ -5958,9 +5937,9 @@
           <w:sz w:val="20"/>
           <w:lang w:val="de-CH"/>
         </w:rPr>
-        <w:t xml:space="preserve">  vgl.</w:t>
-      </w:r>
-      <w:proofErr w:type="gramEnd"/>
+        <w:t>Agentic</w:t>
+      </w:r>
+      <w:proofErr w:type="spellEnd"/>
       <w:r>
         <w:rPr>
           <w:i/>
@@ -5968,9 +5947,106 @@
           <w:sz w:val="20"/>
           <w:lang w:val="de-CH"/>
         </w:rPr>
-        <w:t xml:space="preserve"> Tag 06 Kennel Vektordatenbanken; Tag 05 </w:t>
+        <w:t xml:space="preserve"> AI Sicherheitsregeln</w:t>
+      </w:r>
+    </w:p>
+    <w:p>
+      <w:pPr>
+        <w:pStyle w:val="Aufzhlungszeichen2"/>
+      </w:pPr>
+      <w:r>
+        <w:t xml:space="preserve">Input: </w:t>
       </w:r>
       <w:proofErr w:type="spellStart"/>
+      <w:r>
+        <w:t>Freitext-Kompetenznachweis</w:t>
+      </w:r>
+      <w:proofErr w:type="spellEnd"/>
+      <w:r>
+        <w:t xml:space="preserve"> des </w:t>
+      </w:r>
+      <w:proofErr w:type="spellStart"/>
+      <w:r>
+        <w:t>Lernenden</w:t>
+      </w:r>
+      <w:proofErr w:type="spellEnd"/>
+    </w:p>
+    <w:p>
+      <w:pPr>
+        <w:pStyle w:val="Aufzhlungszeichen2"/>
+        <w:rPr>
+          <w:lang w:val="de-CH"/>
+        </w:rPr>
+      </w:pPr>
+      <w:r>
+        <w:rPr>
+          <w:lang w:val="de-CH"/>
+        </w:rPr>
+        <w:t>Output: Bloom-Stufe K1–K6 + Begründung + Konfidenzwert</w:t>
+      </w:r>
+    </w:p>
+    <w:p>
+      <w:pPr>
+        <w:pStyle w:val="Aufzhlungszeichen2"/>
+        <w:rPr>
+          <w:lang w:val="de-CH"/>
+        </w:rPr>
+      </w:pPr>
+      <w:r>
+        <w:rPr>
+          <w:lang w:val="de-CH"/>
+        </w:rPr>
+        <w:t>Prompt-Design: Few-Shot mit Bloom-Beispielen aus Bildungsplan EFZ</w:t>
+      </w:r>
+    </w:p>
+    <w:p>
+      <w:pPr>
+        <w:pStyle w:val="Aufzhlungszeichen2"/>
+        <w:rPr>
+          <w:lang w:val="de-CH"/>
+        </w:rPr>
+      </w:pPr>
+      <w:r>
+        <w:rPr>
+          <w:lang w:val="de-CH"/>
+        </w:rPr>
+        <w:t>Menschliche Kontrolle: Berufsbildner muss KI-Vorschlag explizit bestätigen</w:t>
+      </w:r>
+    </w:p>
+    <w:p>
+      <w:pPr>
+        <w:pStyle w:val="Aufzhlungszeichen"/>
+        <w:rPr>
+          <w:lang w:val="de-CH"/>
+        </w:rPr>
+      </w:pPr>
+      <w:r>
+        <w:rPr>
+          <w:lang w:val="de-CH"/>
+        </w:rPr>
+        <w:t xml:space="preserve">KI 3: Embedding-basierte Ähnlichkeitssuche (Azure OpenAI </w:t>
+      </w:r>
+      <w:proofErr w:type="spellStart"/>
+      <w:r>
+        <w:rPr>
+          <w:lang w:val="de-CH"/>
+        </w:rPr>
+        <w:t>Embeddings</w:t>
+      </w:r>
+      <w:proofErr w:type="spellEnd"/>
+      <w:r>
+        <w:rPr>
+          <w:lang w:val="de-CH"/>
+        </w:rPr>
+        <w:t xml:space="preserve"> + </w:t>
+      </w:r>
+      <w:proofErr w:type="gramStart"/>
+      <w:r>
+        <w:rPr>
+          <w:lang w:val="de-CH"/>
+        </w:rPr>
+        <w:t>Vektordatenbank)</w:t>
+      </w:r>
       <w:r>
         <w:rPr>
           <w:i/>
@@ -5978,9 +6054,9 @@
           <w:sz w:val="20"/>
           <w:lang w:val="de-CH"/>
         </w:rPr>
-        <w:t>LiteLLM</w:t>
-      </w:r>
-      <w:proofErr w:type="spellEnd"/>
+        <w:t xml:space="preserve">  vgl.</w:t>
+      </w:r>
+      <w:proofErr w:type="gramEnd"/>
       <w:r>
         <w:rPr>
           <w:i/>
@@ -5988,65 +6064,9 @@
           <w:sz w:val="20"/>
           <w:lang w:val="de-CH"/>
         </w:rPr>
-        <w:t xml:space="preserve"> Gateway</w:t>
-      </w:r>
-    </w:p>
-    <w:p>
-      <w:pPr>
-        <w:pStyle w:val="Aufzhlungszeichen2"/>
-        <w:rPr>
-          <w:lang w:val="de-CH"/>
-        </w:rPr>
-      </w:pPr>
-      <w:r>
-        <w:rPr>
-          <w:lang w:val="de-CH"/>
-        </w:rPr>
-        <w:t>Use Case: Ähnliche Kompetenznachweise aus Vergangenheit abrufen</w:t>
-      </w:r>
-    </w:p>
-    <w:p>
-      <w:pPr>
-        <w:pStyle w:val="Aufzhlungszeichen2"/>
-      </w:pPr>
-      <w:r>
-        <w:t>Technologie: Azure Cognitive Search oder pgvector (PostgreSQL)</w:t>
-      </w:r>
-    </w:p>
-    <w:p>
-      <w:pPr>
-        <w:pStyle w:val="Aufzhlungszeichen2"/>
-        <w:rPr>
-          <w:lang w:val="de-CH"/>
-        </w:rPr>
-      </w:pPr>
-      <w:r>
-        <w:rPr>
-          <w:lang w:val="de-CH"/>
-        </w:rPr>
-        <w:t>Ziel: Konsistenz in Bewertungen über verschiedene Berufsbildner/Jahrgänge</w:t>
-      </w:r>
-    </w:p>
-    <w:p>
-      <w:pPr>
-        <w:pStyle w:val="Aufzhlungszeichen"/>
-        <w:rPr>
-          <w:lang w:val="de-CH"/>
-        </w:rPr>
-      </w:pPr>
-      <w:r>
-        <w:rPr>
-          <w:lang w:val="de-CH"/>
-        </w:rPr>
-        <w:t xml:space="preserve">KI 3: Claude Code (Anthropic) als KI-gestütztes </w:t>
-      </w:r>
-      <w:proofErr w:type="gramStart"/>
-      <w:r>
-        <w:rPr>
-          <w:lang w:val="de-CH"/>
-        </w:rPr>
-        <w:t>Entwicklungswerkzeug</w:t>
-      </w:r>
+        <w:t xml:space="preserve"> Tag 06 Kennel Vektordatenbanken; Tag 05 </w:t>
+      </w:r>
+      <w:proofErr w:type="spellStart"/>
       <w:r>
         <w:rPr>
           <w:i/>
@@ -6054,9 +6074,9 @@
           <w:sz w:val="20"/>
           <w:lang w:val="de-CH"/>
         </w:rPr>
-        <w:t xml:space="preserve">  vgl.</w:t>
-      </w:r>
-      <w:proofErr w:type="gramEnd"/>
+        <w:t>LiteLLM</w:t>
+      </w:r>
+      <w:proofErr w:type="spellEnd"/>
       <w:r>
         <w:rPr>
           <w:i/>
@@ -6064,56 +6084,123 @@
           <w:sz w:val="20"/>
           <w:lang w:val="de-CH"/>
         </w:rPr>
-        <w:t xml:space="preserve"> Tag 02 RARIX 4-Layer / Tag 01 SDD</w:t>
+        <w:t xml:space="preserve"> Gateway</w:t>
       </w:r>
     </w:p>
     <w:p>
       <w:pPr>
         <w:pStyle w:val="Aufzhlungszeichen2"/>
-      </w:pPr>
-      <w:r>
-        <w:t>Enabler-Rolle (sine qua non): Der Berufsbildner und Projektverantwortliche verfügt über kein aktives Programmier-Knowhow. Claude Code ermöglicht ihm als Domain-Experten, eine professionelle Full-Stack-Webapplikation (React/TypeScript + ASP.NET Core + SQL Server + Azure) zu realisieren. Ohne KI wäre dieses Projekt strukturell unmöglich – die App würde nicht existieren. Claude Code ist damit keine Effizienzsteigerung, sondern die Voraussetzung für die Existenz des Projekts.</w:t>
+        <w:rPr>
+          <w:lang w:val="de-CH"/>
+        </w:rPr>
+      </w:pPr>
+      <w:r>
+        <w:rPr>
+          <w:lang w:val="de-CH"/>
+        </w:rPr>
+        <w:t>Use Case: Ähnliche Kompetenznachweise aus Vergangenheit abrufen</w:t>
       </w:r>
     </w:p>
     <w:p>
       <w:pPr>
         <w:pStyle w:val="Aufzhlungszeichen2"/>
-        <w:rPr>
-          <w:lang w:val="de-CH"/>
-        </w:rPr>
-      </w:pPr>
-      <w:r>
-        <w:rPr>
-          <w:lang w:val="de-CH"/>
-        </w:rPr>
-        <w:t>Einsatz: Spezifikationsgetriebene Weiterentwicklung (SDD-Prinzip)</w:t>
+      </w:pPr>
+      <w:r>
+        <w:t>Technologie: Azure Cognitive Search oder pgvector (PostgreSQL)</w:t>
       </w:r>
     </w:p>
     <w:p>
       <w:pPr>
         <w:pStyle w:val="Aufzhlungszeichen2"/>
-      </w:pPr>
-      <w:proofErr w:type="spellStart"/>
-      <w:r>
-        <w:t>Qualitätssicherung</w:t>
-      </w:r>
-      <w:proofErr w:type="spellEnd"/>
-      <w:r>
-        <w:t>: Hooks &amp; Harnesses (ESLint, Tests)</w:t>
+        <w:rPr>
+          <w:lang w:val="de-CH"/>
+        </w:rPr>
+      </w:pPr>
+      <w:r>
+        <w:rPr>
+          <w:lang w:val="de-CH"/>
+        </w:rPr>
+        <w:t>Ziel: Konsistenz in Bewertungen über verschiedene Berufsbildner/Jahrgänge</w:t>
+      </w:r>
+    </w:p>
+    <w:p>
+      <w:pPr>
+        <w:pStyle w:val="Aufzhlungszeichen"/>
+      </w:pPr>
+      <w:r>
+        <w:t>KI 4: Basisdaten-Import – Strukturierte Aufbereitung von Bildungsplänen und Ausbildungsplatz-Kompetenzen  vgl. [R50] SBFI 2020; [R07] SBFI 2022</w:t>
       </w:r>
     </w:p>
     <w:p>
       <w:pPr>
         <w:pStyle w:val="Aufzhlungszeichen2"/>
-        <w:rPr>
-          <w:lang w:val="de-CH"/>
-        </w:rPr>
-      </w:pPr>
-      <w:r>
-        <w:rPr>
-          <w:lang w:val="de-CH"/>
-        </w:rPr>
-        <w:t>Dokumentation: arc42-Architektur, ADRs via MADR v4</w:t>
+      </w:pPr>
+      <w:r>
+        <w:t>Input: PDF-Bildungspläne des SBFI (Informatiker/in EFZ, ICT-Fachmann/-frau EFZ) sowie Excel-Dateien mit Ausbildungsplatz-Kompetenzen (Rotationsplanung, AP-Kompetenzmatrix)</w:t>
+      </w:r>
+    </w:p>
+    <w:p>
+      <w:pPr>
+        <w:pStyle w:val="Aufzhlungszeichen2"/>
+      </w:pPr>
+      <w:r>
+        <w:t>Aktueller Stand: Kompetenzziele der Bildungspläne sind als vorstrukturierte JSON-Dateien im Backend hinterlegt (kompetenzen-informatiker-efz.json, kompetenzen-ict-fachmann-efz.json) – gepflegt durch den Berufsbildner. KI-gestützter PDF-Import ist als Erweiterung geplant.</w:t>
+      </w:r>
+    </w:p>
+    <w:p>
+      <w:pPr>
+        <w:pStyle w:val="Aufzhlungszeichen2"/>
+      </w:pPr>
+      <w:r>
+        <w:t>Geplanter KI-Einsatz: LLM-gestützte Extraktion und Strukturierung von Handlungskompetenzen, Leistungszielen und Bloom-Niveaus direkt aus den SBFI-Bildungsplan-PDFs – damit bei Planänderungen kein manueller Pflegeaufwand durch den Berufsbildner entsteht.</w:t>
+      </w:r>
+    </w:p>
+    <w:p>
+      <w:pPr>
+        <w:pStyle w:val="Aufzhlungszeichen2"/>
+      </w:pPr>
+      <w:r>
+        <w:t>XLSX-Import: Kompetenzen der Ausbildungsplätze (welche HKs an welchem AP erlangt werden können) sollen per Excel-Upload importierbar werden – KI verarbeitet semi-strukturierte Daten und gleicht sie mit den Bildungsplan-HKs ab.</w:t>
+      </w:r>
+    </w:p>
+    <w:p>
+      <w:pPr>
+        <w:pStyle w:val="Aufzhlungszeichen"/>
+      </w:pPr>
+      <w:r>
+        <w:t>KI 5: Dokumentenbeurteilung – KI-gestützte Analyse von Lernenden-Dokumenten  vgl. [R10] Abrahamsson et al. 2025; AiEvaluationService.cs</w:t>
+      </w:r>
+    </w:p>
+    <w:p>
+      <w:pPr>
+        <w:pStyle w:val="Aufzhlungszeichen2"/>
+      </w:pPr>
+      <w:r>
+        <w:t>Input: Von Lernenden hochgeladene Dokumente (PDF, DOCX, TXT, max. 8 000 Zeichen) – z. B. Projektberichte, Lerntagebücher, Reflexionstexte</w:t>
+      </w:r>
+    </w:p>
+    <w:p>
+      <w:pPr>
+        <w:pStyle w:val="Aufzhlungszeichen2"/>
+      </w:pPr>
+      <w:r>
+        <w:t>KI-Prozess: Azure OpenAI GPT-4o analysiert den Dokumenttext anhand der Leistungsziele aus dem Bildungsplan EFZ (inklusive Bloom-Definitionen K1–K6) und gibt ein strukturiertes JSON-Ergebnis zurück: Kurzbeschreibung, Umsetzungsmethode, erkannte Lücken sowie bis zu zehn Kompetenz-Zuordnungen mit Bloom-Stufe und Konfidenzwert.</w:t>
+      </w:r>
+    </w:p>
+    <w:p>
+      <w:pPr>
+        <w:pStyle w:val="Aufzhlungszeichen2"/>
+      </w:pPr>
+      <w:r>
+        <w:t>Implementierungsstatus: Vollständig implementiert (AiEvaluationService.cs, Endpunkt POST /users/{userId}/documents/{docId}/ai-evaluate). Frontend-Button «✦ AI-Analyse starten» in DokumenteView.tsx. Derzeit deaktiviert – in Betrieb sobald FHNW Azure-AI-Foundry-Key verfügbar.</w:t>
+      </w:r>
+    </w:p>
+    <w:p>
+      <w:pPr>
+        <w:pStyle w:val="Aufzhlungszeichen2"/>
+      </w:pPr>
+      <w:r>
+        <w:t>Menschliche Kontrolle (Human-in-the-Loop): KI-Vorschläge werden dem Lernenden zur Übernahme angeboten; Bloom-Stufe darf den im Bildungsplan definierten Maximalwert des jeweiligen Lernziels nicht überschreiten. Endgültige Bewertung erfordert Bestätigung durch Praxisplatzbetreuer.</w:t>
       </w:r>
     </w:p>
     <w:p>
@@ -12509,6 +12596,14 @@
       </w:pPr>
       <w:r>
         <w:t>[R49] SDBB / Berufsbildung.ch. (o. J.). Dokumentieren und Bewerten – Bildungsbericht und Lerndokumentation in der beruflichen Grundbildung. Schweizerisches Dienstleistungszentrum Berufsbildung. https://www.berufsbildung.ch/de/lehrverlauf/dokumentieren-und-bewerten</w:t>
+      </w:r>
+    </w:p>
+    <w:p>
+      <w:pPr>
+        <w:pStyle w:val="Listenabsatz"/>
+      </w:pPr>
+      <w:r>
+        <w:t>[R50] SBFI. (2020, 19. November). Bildungsplan zur Verordnung über die berufliche Grundbildung – Informatikerin EFZ / Informatiker EFZ. Staatssekretariat für Bildung, Forschung und Innovation. https://www.ict-berufsbildung.ch/ressourcen/bildungsverordnungen/</w:t>
       </w:r>
     </w:p>
     <w:p>

</xml_diff>

<commit_message>
feat: Kapitel 2.3 Benefits – Restrukturierung nach Prioritaeten
- Qualitative Primaer-Benefits (B1-B5) vor quantitativen Sekundaer-Benefits
- B1 (neu): Transparenz als Systemnutzen fuer alle 3 Rollen (Chapter AUP Konstitution)
- B2 (neu): Qualitaetserhoehung durch Bloom-Taxonomie + KI-Formulierungshilfe
- B3 (war B1): Rotationsplanung um Luecken-Argument ergaenzt
- B4 (neu): Rechtskonformitaet - BBG Art. 20 Bildungsberichte strukturiert erfuellen
- B5 (war B2): Upskilling Berufsbildner
- B6 (war B1 Quant): Zeitersparnis als Sekundaereffekt mit Messungs-Hinweis
- B7 (war B2 Quant): Konsistenz / Inter-Rater-Reliabilitaet
- B8 (neu): CIT als KI-Proof-of-Concept / strategischer Organisationsbenefit
- Fliesstext-Intro: Primaerziel = Transparenz + Qualitaet, nicht Zeitersparnis

Co-Authored-By: Claude Sonnet 4.6 <noreply@anthropic.com>
</commit_message>
<xml_diff>
--- a/doku/HKTracker_CAS_Abschlussarbeit_Entwurf_v01.docx
+++ b/doku/HKTracker_CAS_Abschlussarbeit_Entwurf_v01.docx
@@ -6467,15 +6467,224 @@
     </w:p>
     <w:p>
       <w:pPr>
+        <w:pStyle w:val="Standard"/>
+      </w:pPr>
+      <w:r>
+        <w:t>Die erwarteten Benefits des HK-Trackers werden bewusst nicht mit der Zeitersparnis eroeffnet - diese ist ein willkommener Sekundaereffekt, aber nicht das strategische Primaerziel. Die Leitfrage lautet: Welchen qualitativen Sprung erleben Lernende, Praxisplatzbetreuer und Berufsbildner in der Kompetenzentwicklung? Entsprechend gliedert sich die Benefit-Analyse in: qualitative Primaer-Benefits (B1-B5), die Transparenz und Beurteilungsqualitaet adressieren; quantifizierbare Sekundaer-Benefits (B6-B7) mit messbaren Effizienzgewinnen; sowie einen strategischen Organisationsbenefit (B8) fuer den CIT-Transformationspfad.</w:t>
+      </w:r>
+    </w:p>
+    <w:p>
+      <w:pPr>
         <w:pStyle w:val="Aufzhlungszeichen"/>
       </w:pPr>
       <w:r>
-        <w:t>Quantitativer Benefit 1: Zeitersparnis Berufsbildner</w:t>
+        <w:t>Qualitativer Benefit 1: Transparenz - Einheitliche Datenbasis fuer alle drei Rollen  vgl. [R43] Chapter AUP Konstitution; [R42] Kuhn 2024</w:t>
       </w:r>
     </w:p>
     <w:p>
       <w:pPr>
         <w:pStyle w:val="Aufzhlungszeichen2"/>
+      </w:pPr>
+      <w:r>
+        <w:t>Lernende, Praxisplatzbetreuer und Berufsbildner sehen erstmals dieselben Kompetenznachweise, Bewertungen und Fortschrittsdaten in Echtzeit. Bisher existierten drei parallele, inkompatible Sichten: Excel-Tabellen beim Berufsbildner, muendliche Ueberlieferung an den APs und situative Lerndokumentation der Lernenden.</w:t>
+      </w:r>
+    </w:p>
+    <w:p>
+      <w:pPr>
+        <w:pStyle w:val="Aufzhlungszeichen2"/>
+      </w:pPr>
+      <w:r>
+        <w:t>Konstitutionsanforderung erfuellt: Das Chapter AUP hat in seiner Konstitution eine "High-Level Sicht zu individuellen Kompetenzfortschritten" als Leistungsmerkmal verankert (vgl. [R43]). Der HK-Tracker liefert genau diese Sicht - erstmals digital, strukturiert und aktuell.</w:t>
+      </w:r>
+    </w:p>
+    <w:p>
+      <w:pPr>
+        <w:pStyle w:val="Aufzhlungszeichen2"/>
+      </w:pPr>
+      <w:r>
+        <w:t>AP-Wechsel ohne Informationsverlust: Neue Praxisplatzbetreuer koennen Lernende sofort anhand ihrer bisherigen HK-Nachweise einordnen und gezielt an offenen Kompetenzen weiterarbeiten - statt von Null zu starten.</w:t>
+      </w:r>
+    </w:p>
+    <w:p>
+      <w:pPr>
+        <w:pStyle w:val="Aufzhlungszeichen"/>
+      </w:pPr>
+      <w:r>
+        <w:t>Qualitativer Benefit 2: Qualitaetserhoehung - Bloom-Taxonomie als Bewertungsstandard  vgl. [R10] Abrahamsson et al. 2025; Tag 08 Bloom-Stufen</w:t>
+      </w:r>
+    </w:p>
+    <w:p>
+      <w:pPr>
+        <w:pStyle w:val="Aufzhlungszeichen2"/>
+      </w:pPr>
+      <w:r>
+        <w:t>Kompetenzbewertungen folgen neu einem einheitlichen paedagogischen Rahmen (Bloom-Taxonomie K1-K6). IT-Spezialisten ohne didaktische Grundausbildung erhalten eine methodische Stuetze, die bisher fehlte - Bewertungen entstehen nicht mehr intuitiv, sondern begruendet.</w:t>
+      </w:r>
+    </w:p>
+    <w:p>
+      <w:pPr>
+        <w:pStyle w:val="Aufzhlungszeichen2"/>
+      </w:pPr>
+      <w:r>
+        <w:t>KI schlaegt nicht nur die Bloom-Stufe vor, sondern generiert auch eine sprachliche Begruendung. IT-Fachkraefte, die sich mit paedagogischen Formulierungen schwertun, werden aktiv unterstuetzt (vgl. Abschnitt 2.1 IST-Wertstrom: "Informatiker tun sich schwer mit Bewertungsformulierungen").</w:t>
+      </w:r>
+    </w:p>
+    <w:p>
+      <w:pPr>
+        <w:pStyle w:val="Aufzhlungszeichen2"/>
+      </w:pPr>
+      <w:r>
+        <w:t>Bildungsberichte werden fundierter und vergleichbarer: statt subjektiver Einschaetzung strukturierte, begruendete Bewertungen als Grundlage fuer Abschlusspruefungen und Bildungsgespraeche.</w:t>
+      </w:r>
+    </w:p>
+    <w:p>
+      <w:pPr>
+        <w:pStyle w:val="Aufzhlungszeichen"/>
+      </w:pPr>
+      <w:proofErr w:type="spellStart"/>
+      <w:r>
+        <w:t>Qualitativer Benefit 3: Bessere Rotationsplanung</w:t>
+      </w:r>
+      <w:proofErr w:type="spellEnd"/>
+      <w:r>
+        <w:t xml:space="preserve"/>
+      </w:r>
+      <w:proofErr w:type="spellStart"/>
+      <w:r>
+        <w:t/>
+      </w:r>
+      <w:proofErr w:type="spellEnd"/>
+      <w:r>
+        <w:t xml:space="preserve"/>
+      </w:r>
+    </w:p>
+    <w:p>
+      <w:pPr>
+        <w:pStyle w:val="Aufzhlungszeichen2"/>
+        <w:rPr>
+          <w:lang w:val="de-CH"/>
+        </w:rPr>
+      </w:pPr>
+      <w:r>
+        <w:rPr>
+          <w:lang w:val="de-CH"/>
+        </w:rPr>
+        <w:t>Lernende werden gezielter in Ausbildungsplätze rotiert (Lücken sichtbar)</w:t>
+      </w:r>
+    </w:p>
+    <w:p>
+      <w:pPr>
+        <w:pStyle w:val="Aufzhlungszeichen2"/>
+      </w:pPr>
+      <w:proofErr w:type="spellStart"/>
+      <w:r>
+        <w:t>Reduktion</w:t>
+      </w:r>
+      <w:proofErr w:type="spellEnd"/>
+      <w:r>
+        <w:t xml:space="preserve"> von «</w:t>
+      </w:r>
+      <w:proofErr w:type="spellStart"/>
+      <w:r>
+        <w:t>vergessenen</w:t>
+      </w:r>
+      <w:proofErr w:type="spellEnd"/>
+      <w:r>
+        <w:t xml:space="preserve">» </w:t>
+      </w:r>
+      <w:proofErr w:type="spellStart"/>
+      <w:r>
+        <w:t>Handlungskompetenzen</w:t>
+      </w:r>
+      <w:proofErr w:type="spellEnd"/>
+    </w:p>
+    <w:p>
+      <w:pPr>
+        <w:pStyle w:val="Aufzhlungszeichen2"/>
+      </w:pPr>
+      <w:r>
+        <w:t>Handlungskompetenzen, die ein Lernender an einem AP bereits nachgewiesen hat, sind beim naechsten Wechsel sofort sichtbar. Rotationsverantwortliche im Chapter AUP koennen Luecken gezielt schliessen statt zufaellig zuzuweisen.</w:t>
+      </w:r>
+    </w:p>
+    <w:p>
+      <w:pPr>
+        <w:pStyle w:val="Aufzhlungszeichen"/>
+      </w:pPr>
+      <w:r>
+        <w:t>Qualitativer Benefit 4: Rechtskonformitaet - Strukturierte Grundlage fuer Bildungsberichte  vgl. [R49] berufsbildung.ch; BBG Art. 20</w:t>
+      </w:r>
+    </w:p>
+    <w:p>
+      <w:pPr>
+        <w:pStyle w:val="Aufzhlungszeichen2"/>
+      </w:pPr>
+      <w:r>
+        <w:t>Bildungsberichte sind gesetzlich vorgeschrieben (BBG Art. 20 und Bildungsverordnung): Praxisplatzbetreuer muessen mindestens einmal pro Semester einen Bericht erstellen (vgl. [R49]). Bisher entstehen diese ohne strukturierte Datenbasis und ohne methodischen Bezug zur Bloom-Taxonomie.</w:t>
+      </w:r>
+    </w:p>
+    <w:p>
+      <w:pPr>
+        <w:pStyle w:val="Aufzhlungszeichen2"/>
+      </w:pPr>
+      <w:r>
+        <w:t>Der HK-Tracker stellt alle relevanten Daten direkt fuer die Berichterstellung bereit: nachgewiesene Kompetenzen, Bloom-Niveaus, KI-generierte Begruendungen und offene Luecken - redaktioneller Aufwand sinkt, Qualitaet steigt.</w:t>
+      </w:r>
+    </w:p>
+    <w:p>
+      <w:pPr>
+        <w:pStyle w:val="Aufzhlungszeichen2"/>
+      </w:pPr>
+      <w:r>
+        <w:t>Nachweisbarkeit und Revisionsicherheit: Kompetenzeinschaetzungen und Bildungsberichte sind historisch gespeichert - relevant bei kantonalen Ueberpruefungen und im Rahmen der Abschlusspruefungen (QV).</w:t>
+      </w:r>
+    </w:p>
+    <w:p>
+      <w:pPr>
+        <w:pStyle w:val="Aufzhlungszeichen"/>
+      </w:pPr>
+      <w:r>
+        <w:t>Qualitativer Benefit 5: Upskilling Berufsbildner</w:t>
+      </w:r>
+    </w:p>
+    <w:p>
+      <w:pPr>
+        <w:pStyle w:val="Aufzhlungszeichen2"/>
+      </w:pPr>
+      <w:r>
+        <w:rPr>
+          <w:lang w:val="de-CH"/>
+        </w:rPr>
+        <w:t>Berufsbildner lernen durch KI-Begründungen mehr über Bloom-</w:t>
+      </w:r>
+      <w:proofErr w:type="gramStart"/>
+      <w:r>
+        <w:rPr>
+          <w:lang w:val="de-CH"/>
+        </w:rPr>
+        <w:t>Taxonomie  vgl.</w:t>
+      </w:r>
+      <w:proofErr w:type="gramEnd"/>
+      <w:r>
+        <w:rPr>
+          <w:lang w:val="de-CH"/>
+        </w:rPr>
+        <w:t xml:space="preserve"> </w:t>
+      </w:r>
+      <w:r>
+        <w:t>[R10] Tag 03: GenAI für Upskilling/Reskilling</w:t>
+      </w:r>
+    </w:p>
+    <w:p>
+      <w:pPr>
+        <w:pStyle w:val="Aufzhlungszeichen"/>
+      </w:pPr>
+      <w:r>
+        <w:t>Quantitativer Benefit 6: Zeitersparnis Berufsbildner</w:t>
+      </w:r>
+    </w:p>
+    <w:p>
+      <w:pPr>
+        <w:pStyle w:val="Aufzhlungszeichen2"/>
         <w:rPr>
           <w:lang w:val="de-CH"/>
         </w:rPr>
@@ -6513,6 +6722,14 @@
           <w:lang w:val="de-CH"/>
         </w:rPr>
         <w:t>Hochrechnung: [X Lernende] × [Z Nachweise/Jahr] = [Stunden/Jahr gespart]</w:t>
+      </w:r>
+    </w:p>
+    <w:p>
+      <w:pPr>
+        <w:pStyle w:val="Aufzhlungszeichen2"/>
+      </w:pPr>
+      <w:r>
+        <w:t>Hinweis: Zeitersparnis ist als Sekundaereffekt eingestuft, nicht als primaeres Projektziel (vgl. 2.1 SOLL-Wertstrom). Konkrete Basisdaten werden im Pilotbetrieb (Phase 3) erhoben. Schaetzung: ca. 5-10 Min. manuelle Bloom-Bewertung vs. ca. 1-2 Min. KI-Vorschlag bestaetigen.</w:t>
       </w:r>
     </w:p>
     <w:p>
@@ -6543,7 +6760,7 @@
           <w:lang w:val="de-CH"/>
         </w:rPr>
         <w:lastRenderedPageBreak/>
-        <w:t>Quantitativer Benefit 2: Konsistenz der Bloom-Bewertungen</w:t>
+        <w:t>Quantitativer Benefit 7: Konsistenz der Bloom-Bewertungen</w:t>
       </w:r>
     </w:p>
     <w:p>
@@ -6578,69 +6795,24 @@
       <w:pPr>
         <w:pStyle w:val="Aufzhlungszeichen"/>
       </w:pPr>
-      <w:proofErr w:type="spellStart"/>
-      <w:r>
-        <w:t>Qualitativer</w:t>
-      </w:r>
-      <w:proofErr w:type="spellEnd"/>
-      <w:r>
-        <w:t xml:space="preserve"> Benefit 1: </w:t>
-      </w:r>
-      <w:proofErr w:type="spellStart"/>
-      <w:r>
-        <w:t>Bessere</w:t>
-      </w:r>
-      <w:proofErr w:type="spellEnd"/>
-      <w:r>
-        <w:t xml:space="preserve"> Rotationsplanung</w:t>
+      <w:r>
+        <w:t>Strategischer Benefit B8: HK-Tracker als KI-Proof-of-Concept fuer die CIT  vgl. [R46] CAS AI-SE; [R47] AI-Reiseplan CIT</w:t>
       </w:r>
     </w:p>
     <w:p>
       <w:pPr>
         <w:pStyle w:val="Aufzhlungszeichen2"/>
-        <w:rPr>
-          <w:lang w:val="de-CH"/>
-        </w:rPr>
-      </w:pPr>
-      <w:r>
-        <w:rPr>
-          <w:lang w:val="de-CH"/>
-        </w:rPr>
-        <w:t>Lernende werden gezielter in Ausbildungsplätze rotiert (Lücken sichtbar)</w:t>
+      </w:pPr>
+      <w:r>
+        <w:t>Das Projekt demonstriert in der Praxis, dass Domain-Experten ohne aktive Programmierkenntnisse mit KI-Unterstuetzung professionelle Full-Stack-Webapplikationen realisieren koennen. Fuer die KI-Transformationsstrategie der CIT (vgl. [R47]) ist dieser Befund direkt relevant: Wissensarbeit veraendert sich fundamental - KI veraendert nicht einzelne Tools, sondern die Art, wie Probleme geloest werden.</w:t>
       </w:r>
     </w:p>
     <w:p>
       <w:pPr>
         <w:pStyle w:val="Aufzhlungszeichen2"/>
       </w:pPr>
-      <w:proofErr w:type="spellStart"/>
-      <w:r>
-        <w:t>Reduktion</w:t>
-      </w:r>
-      <w:proofErr w:type="spellEnd"/>
-      <w:r>
-        <w:t xml:space="preserve"> von «</w:t>
-      </w:r>
-      <w:proofErr w:type="spellStart"/>
-      <w:r>
-        <w:t>vergessenen</w:t>
-      </w:r>
-      <w:proofErr w:type="spellEnd"/>
-      <w:r>
-        <w:t xml:space="preserve">» </w:t>
-      </w:r>
-      <w:proofErr w:type="spellStart"/>
-      <w:r>
-        <w:t>Handlungskompetenzen</w:t>
-      </w:r>
-      <w:proofErr w:type="spellEnd"/>
-    </w:p>
-    <w:p>
-      <w:pPr>
-        <w:pStyle w:val="Aufzhlungszeichen"/>
-      </w:pPr>
-      <w:r>
-        <w:t>Qualitativer Benefit 2: Upskilling Berufsbildner</w:t>
+      <w:r>
+        <w:t>Der HK-Tracker liefert dem Chapter AI praktische Erkenntnisse ueber Azure AI Foundry-Integration, LiteLLM-Gateway-Betrieb und Human-in-the-Loop-Design in einem internen FHNW-Kontext - uebertragbares Wissen fuer weitere CIT-Projekte.</w:t>
       </w:r>
     </w:p>
     <w:p>
@@ -6648,27 +6820,7 @@
         <w:pStyle w:val="Aufzhlungszeichen2"/>
       </w:pPr>
       <w:r>
-        <w:rPr>
-          <w:lang w:val="de-CH"/>
-        </w:rPr>
-        <w:t>Berufsbildner lernen durch KI-Begründungen mehr über Bloom-</w:t>
-      </w:r>
-      <w:proofErr w:type="gramStart"/>
-      <w:r>
-        <w:rPr>
-          <w:lang w:val="de-CH"/>
-        </w:rPr>
-        <w:t>Taxonomie  vgl.</w:t>
-      </w:r>
-      <w:proofErr w:type="gramEnd"/>
-      <w:r>
-        <w:rPr>
-          <w:lang w:val="de-CH"/>
-        </w:rPr>
-        <w:t xml:space="preserve"> </w:t>
-      </w:r>
-      <w:r>
-        <w:t>[R10] Tag 03: GenAI für Upskilling/Reskilling</w:t>
+        <w:t>Als CAS AI-SE Abschlussarbeit (vgl. [R46]) dokumentiert das Projekt nicht nur das Produkt, sondern den Entwicklungsprozess als Lernfeld: Wie funktioniert KI-gestuetzte Softwareentwicklung durch einen nicht-programmierenden Domain-Experten in einer Schweizer Bildungsinstitution?</w:t>
       </w:r>
     </w:p>
     <w:p>

</xml_diff>

<commit_message>
feat: Kapitel 3.1 Tooling – KI-Workflow, PowerPoint, Enterprise Architekt
- Fliesstext-Intro: zwei Spezifikations-Modalitaeten erklaert (PPTX + verbal)
- Claude Code: Modell (claude-sonnet-4-6), Abo CHF 20, Arbeitgeber max CHF 19.99
- PowerPoint Mockups: 21 Slides als visuelle UI-Guideline fuer Claude Code
- Verbale Spezifikation: Lernende-AP-Zuweisung von AI designed ohne Mockup
- Enterprise Architekt Entscheid: Azure + MS SQL Server als vorgegebener Stack

Co-Authored-By: Claude Sonnet 4.6 <noreply@anthropic.com>
</commit_message>
<xml_diff>
--- a/doku/HKTracker_CAS_Abschlussarbeit_Entwurf_v01.docx
+++ b/doku/HKTracker_CAS_Abschlussarbeit_Entwurf_v01.docx
@@ -7853,6 +7853,14 @@
     </w:p>
     <w:p>
       <w:pPr>
+        <w:pStyle w:val="Standard"/>
+      </w:pPr>
+      <w:r>
+        <w:t>Die Tooling-Entscheide in diesem Projekt sind eng mit dem besonderen Entwicklungskontext verknuepft: Der Projektverantwortliche verfolgt keinen klassischen Softwareentwicklungs-Workflow, sondern einen KI-gestuetzten Spezifikations- und Generierungsansatz. Die Entwicklungsarbeit verlief in zwei Spezifikations-Modalitaeten: einerseits visuelle Mockups in PowerPoint (21 Slides, abgedeckt in Anhang A.4), die als detaillierte UI-Guidelines an Claude Code uebergeben wurden; andererseits verbale Anforderungsbeschreibungen fuer Features, bei denen die KI das Interface-Design selbst vorschlug und umsetzte. Der Techstack selbst wurde nicht frei gewaehlt, sondern in Abstimmung mit dem Enterprise Architekten der FHNW vorgegeben.</w:t>
+      </w:r>
+    </w:p>
+    <w:p>
+      <w:pPr>
         <w:pStyle w:val="Aufzhlungszeichen"/>
       </w:pPr>
       <w:r>
@@ -7935,6 +7943,14 @@
           <w:lang w:val="de-CH"/>
         </w:rPr>
         <w:t>Begründung: FHNW .NET-Stack, Azure-Integration nativ, starke Typisierung</w:t>
+      </w:r>
+    </w:p>
+    <w:p>
+      <w:pPr>
+        <w:pStyle w:val="Aufzhlungszeichen2"/>
+      </w:pPr>
+      <w:r>
+        <w:t>Architekturentscheid durch Enterprise Architekten: Der Techstack wurde nicht frei gewaehlt, sondern in Abstimmung mit dem FHNW Enterprise Architekten festgelegt. Dessen Entscheid: Azure als Hosting-Plattform, Microsoft SQL Server (Azure SQL Database) als Datenbankschicht. Begruendung: Alignment mit bestehender FHNW-Infrastruktur, etablierte Governance-Prozesse, direkter Betriebssupport durch die CIT.</w:t>
       </w:r>
     </w:p>
     <w:p>
@@ -8106,6 +8122,38 @@
       </w:pPr>
       <w:r>
         <w:t>CLAUDE.md + Memory-System als Projektkontext</w:t>
+      </w:r>
+    </w:p>
+    <w:p>
+      <w:pPr>
+        <w:pStyle w:val="Aufzhlungszeichen2"/>
+      </w:pPr>
+      <w:r>
+        <w:t>Modell: claude-sonnet-4-6 (Claude Sonnet, Anthropic, Stand Juni 2026) - eingesetzt ueber Claude.ai Pro-Abonnement sowie Claude Code CLI als VSCode-Extension.</w:t>
+      </w:r>
+    </w:p>
+    <w:p>
+      <w:pPr>
+        <w:pStyle w:val="Aufzhlungszeichen2"/>
+      </w:pPr>
+      <w:r>
+        <w:t>Kosten und Finanzierung: Das Claude Pro-Abonnement kostet ca. CHF 20 pro Monat. Der Arbeitgeber FHNW erstattet KI-Tool-Abonnements bis max. CHF 19.99 pro Monat als Spesen - das Abonnement wird damit vollstaendig durch die Organisation getragen.</w:t>
+      </w:r>
+    </w:p>
+    <w:p>
+      <w:pPr>
+        <w:pStyle w:val="Aufzhlungszeichen2"/>
+      </w:pPr>
+      <w:r>
+        <w:t>PowerPoint als visuelle Spezifikation: Vor dem Codieren wurden UI-Konzepte und Interaktionsablaeufe in Microsoft PowerPoint als Pixel-genaue Wireframes ausgearbeitet (vgl. Anhang A.4: Konzept_Kompetenzen_Ausbildungsplaetze.pptx, 21 Slides). Diese Mockups wurden Claude Code als visuelle Guidelines uebergeben - die KI uebersetzte die Layouts direkt in React/TypeScript-Code. Die Uebereinstimmung zwischen Mockup und Implementierung war hoch; Abweichungen wurden iterativ per Chat-Anweisung korrigiert.</w:t>
+      </w:r>
+    </w:p>
+    <w:p>
+      <w:pPr>
+        <w:pStyle w:val="Aufzhlungszeichen2"/>
+      </w:pPr>
+      <w:r>
+        <w:t>Verbale Spezifikation als Alternative: Features ohne Mockup wurden durch praezise verbale Anforderungsbeschreibungen spezifiziert. Beispiel: die Funktion zur Zuweisung von Lernenden an Ausbildungsplaetze wurde ausschliesslich per Textbeschreibung vorgegeben - Claude Code schlug Interface-Design und Datenmodell selbst vor und setzte beides direkt um.</w:t>
       </w:r>
     </w:p>
     <w:p>

</xml_diff>

<commit_message>
feat: Kapitel 3.4 Stakeholder-Einbezug konkretisiert
- Fliesstext-Intro: Persona-Mapping auf reale Stakeholder-Gruppen
- Stakeholder-Profil KUI: Iwo Kuhn, Leiter ICT Berufsbildung HSI,
  8 Applikationsentwickler EFZ + 3 IMS Praktikanten
- Korrektur: Norbert Seyff = Betreuer Abschlussarbeit (nicht Fricker);
  Samuel Fricker = Studiengangsleiter CAS AI-SE
- Pilotbetrieb zweiphasig: Phase A Schulung+Feedback, Phase B Pilot+Feedback
  mit 2 Lernenden + 1 Praxisplatzbetreuer
- Neu: FHNW-weite Praesentation bei allen Berufsbildungszustaendigen
  mit strukturierter Feedback-Aufnahme

Co-Authored-By: Claude Sonnet 4.6 <noreply@anthropic.com>
</commit_message>
<xml_diff>
--- a/doku/HKTracker_CAS_Abschlussarbeit_Entwurf_v01.docx
+++ b/doku/HKTracker_CAS_Abschlussarbeit_Entwurf_v01.docx
@@ -9920,6 +9920,14 @@
     </w:p>
     <w:p>
       <w:pPr>
+        <w:pStyle w:val="Standard"/>
+      </w:pPr>
+      <w:r>
+        <w:t>Der Stakeholder-Einbezug im HK-Tracker-Projekt orientiert sich an den vier in Abschnitt 1.4.1 definierten Cooper-Personas und deren realen Entsprechungen in der FHNW Corporate IT. Die KUI-Persona (Leiter Berufsbildung) ist identisch mit dem Projektverantwortlichen selbst (Double-Role). Die Michi-Praxisbildner-Persona umfasst die Praxisplatzbetreuer an den zehn CIT-Ausbildungsplaetzen. Die Heinz-Lernenden-Persona repraesentiert die aktuelle Lernenden-Kohorte: acht Lernende in der Fachrichtung Applikationsentwicklung (EFZ) und drei Praktikanten der Informatikmittelschule (IMS). Die Einbindung erfolgt gestaffelt – von informellen Reviews in der Entwicklungsphase bis zur strukturierten Pilotevaluation.</w:t>
+      </w:r>
+    </w:p>
+    <w:p>
+      <w:pPr>
         <w:pStyle w:val="Aufzhlungszeichen"/>
       </w:pPr>
       <w:r>
@@ -9973,6 +9981,14 @@
     <w:p>
       <w:pPr>
         <w:pStyle w:val="Aufzhlungszeichen2"/>
+      </w:pPr>
+      <w:r>
+        <w:t>Stakeholder-Profil Berufsbildner (KUI-Persona): Iwo Kuhn ist Leiter der ICT Berufsbildung an der FHNW Hochschule fuer Informatik (HSI) und verantwortlich fuer die Ausbildung von acht Lernenden in der Fachrichtung Applikationsentwicklung (Informatiker/in EFZ) sowie drei Praktikanten der Informatikmittelschule (IMS). In seiner Rolle als Chapter Lead CP-AUP koordiniert er alle zehn Ausbildungsplaetze der CIT. Als Primaerentwickler und gleichzeitig Hauptnutzer des HK-Trackers repraesentiert er die KUI-Persona direkt (vgl. Abschnitt 1.4).</w:t>
+      </w:r>
+    </w:p>
+    <w:p>
+      <w:pPr>
+        <w:pStyle w:val="Aufzhlungszeichen2"/>
         <w:rPr>
           <w:lang w:val="de-CH"/>
         </w:rPr>
@@ -10023,7 +10039,7 @@
         <w:rPr>
           <w:lang w:val="de-CH"/>
         </w:rPr>
-        <w:t>Konzept-Review durch Betreuer Prof. Dr. Samuel Fricker</w:t>
+        <w:t>Konzept-Review durch Betreuer Prof. Dr. Norbert Seyff (Betreuer Abschlussarbeit, Dozent Personalisierung CAS AI-SE, Modultag 11); Samuel Fricker (Prof. Dr.) ist Studiengangsleiter CAS AI-SE</w:t>
       </w:r>
     </w:p>
     <w:p>
@@ -10038,6 +10054,30 @@
           <w:lang w:val="de-CH"/>
         </w:rPr>
         <w:t>Geplanter Stakeholder-Einbezug (Phase 3 Pilot):</w:t>
+      </w:r>
+    </w:p>
+    <w:p>
+      <w:pPr>
+        <w:pStyle w:val="Aufzhlungszeichen2"/>
+      </w:pPr>
+      <w:r>
+        <w:t>Pilotgruppe: 2 Lernende (Applikationsentwicklung EFZ) + 1 Praxisplatzbetreuer – repraesentieren die Kernpersonas Heinz Platt und Michi Praxisbildner.</w:t>
+      </w:r>
+    </w:p>
+    <w:p>
+      <w:pPr>
+        <w:pStyle w:val="Aufzhlungszeichen2"/>
+      </w:pPr>
+      <w:r>
+        <w:t>Phase A – Schulung und erstes Feedback: Einfuehrungsschulung (~30 Min.) mit Live-Demo und App-Onboarding; anschliessend strukturiertes Feedback zu Verstaendlichkeit, Navigation und KI-Vorschlaegen (Think-Aloud-Protokoll und kurzer Fragebogen).</w:t>
+      </w:r>
+    </w:p>
+    <w:p>
+      <w:pPr>
+        <w:pStyle w:val="Aufzhlungszeichen2"/>
+      </w:pPr>
+      <w:r>
+        <w:t>Phase B – Pilotbetrieb und abschliessendes Feedback: Selbststaendige Nutzung ueber mehrere Wochen im Alltagsbetrieb; anschliessend vertiefte Feedback-Runde zu Nutzungsfrequenz, wahrgenommenem Nutzen, Qualitaet der KI-Bewertungen und Verbesserungsideen.</w:t>
       </w:r>
     </w:p>
     <w:p>
@@ -10141,6 +10181,30 @@
           <w:lang w:val="de-CH"/>
         </w:rPr>
         <w:t xml:space="preserve"> Tag 06 AI4KM Simulation</w:t>
+      </w:r>
+    </w:p>
+    <w:p>
+      <w:pPr>
+        <w:pStyle w:val="Aufzhlungszeichen"/>
+      </w:pPr>
+      <w:r>
+        <w:t>FHNW-weite Praesentation und Feedback-Runde:</w:t>
+      </w:r>
+    </w:p>
+    <w:p>
+      <w:pPr>
+        <w:pStyle w:val="Aufzhlungszeichen2"/>
+      </w:pPr>
+      <w:r>
+        <w:t>Praesentiert wird der HK-Tracker bei allen Berufsbildungszustaendigen der FHNW – ueber die CIT hinaus. Ziel: Bekanntmachung des Projekts, Aufnahme von Rueckmeldungen zu Uebertragbarkeit und Interesse anderer Departemente, Identifikation weiterer Pilotpartner.</w:t>
+      </w:r>
+    </w:p>
+    <w:p>
+      <w:pPr>
+        <w:pStyle w:val="Aufzhlungszeichen2"/>
+      </w:pPr>
+      <w:r>
+        <w:t>Feedback wird strukturiert aufgenommen (Bewertungsdimensionen: Relevanz, Benutzerfreundlichkeit, Erweiterungsbedarf auf andere Lehrberufe) und fliesst in die Weiterentwicklung des HK-Trackers ein.</w:t>
       </w:r>
     </w:p>
     <w:p>

</xml_diff>

<commit_message>
fix: Betreuer auf Titelseite korrigiert – Seyff statt Fricker
</commit_message>
<xml_diff>
--- a/doku/HKTracker_CAS_Abschlussarbeit_Entwurf_v01.docx
+++ b/doku/HKTracker_CAS_Abschlussarbeit_Entwurf_v01.docx
@@ -217,14 +217,14 @@
           <w:sz w:val="24"/>
           <w:lang w:val="de-CH"/>
         </w:rPr>
-        <w:t xml:space="preserve">Betreuer: </w:t>
+        <w:t xml:space="preserve">Betreuer: Prof. Dr. Norbert Seyff, FHNW</w:t>
       </w:r>
       <w:r>
         <w:rPr>
           <w:sz w:val="24"/>
           <w:lang w:val="de-CH"/>
         </w:rPr>
-        <w:t>Prof. Dr. Samuel Fricker, FHNW</w:t>
+        <w:t/>
       </w:r>
     </w:p>
     <w:p>

</xml_diff>